<commit_message>
Historial de conversaciones por usuario, purga automatica a 30 dias y endpoint de identidad
- widget: panel de historial (consultar, retomar, borrar), chat nuevo por sesion
- bridge: ada_whoami.php (identificadores seudonimos de cuenta y sesion)
- n8n: workflow principal con historial por conversacion, workflow de historial y de purga
- anexos actualizados (manual tecnico, instalacion, pruebas, evidencias)

Co-Authored-By: Claude Sonnet 5.5 <noreply@anthropic.com>
</commit_message>
<xml_diff>
--- a/anexos/1_Manual_Tecnico_Arquitectura_Ada.docx
+++ b/anexos/1_Manual_Tecnico_Arquitectura_Ada.docx
@@ -137,7 +137,7 @@
           <w:sz w:val="22"/>
           <w:szCs w:val="22"/>
         </w:rPr>
-        <w:t>Versión 1.0</w:t>
+        <w:t xml:space="preserve">Versión 1.1</w:t>
       </w:r>
     </w:p>
     <w:p>
@@ -554,7 +554,7 @@
                 <w:rFonts w:ascii="Calibri" w:eastAsia="Calibri" w:hAnsi="Calibri" w:cs="Calibri"/>
                 <w:color w:val="222222"/>
               </w:rPr>
-              <w:t>Interfaz de chat flotante; visible solo con sesión iniciada</w:t>
+              <w:t xml:space="preserve">Interfaz de chat flotante con panel de historial de conversaciones; visible solo con sesión iniciada</w:t>
             </w:r>
           </w:p>
         </w:tc>
@@ -719,7 +719,7 @@
                 <w:rFonts w:ascii="Calibri" w:eastAsia="Calibri" w:hAnsi="Calibri" w:cs="Calibri"/>
                 <w:color w:val="222222"/>
               </w:rPr>
-              <w:t>Recibe la consulta, arma el contexto, invoca al modelo y guarda el historial</w:t>
+              <w:t xml:space="preserve">Recibe la consulta, arma el contexto, invoca al modelo y guarda cada conversación (un archivo por usuario y conversación)</w:t>
             </w:r>
           </w:p>
         </w:tc>
@@ -877,6 +877,154 @@
                 <w:color w:val="222222"/>
               </w:rPr>
               <w:t>Fuente de verdad de cursos, unidades y actividades</w:t>
+            </w:r>
+          </w:p>
+        </w:tc>
+      </w:tr>
+      <w:tr>
+        <w:tblPrEx>
+          <w:tblCellMar>
+            <w:top w:w="0" w:type="dxa"/>
+            <w:bottom w:w="0" w:type="dxa"/>
+          </w:tblCellMar>
+        </w:tblPrEx>
+        <w:tc>
+          <w:tcPr>
+            <w:tcW w:w="0" w:type="auto"/>
+            <w:shd w:val="clear" w:color="auto" w:fill="F2F4F5"/>
+            <w:tcMar>
+              <w:top w:w="100" w:type="dxa"/>
+              <w:left w:w="120" w:type="dxa"/>
+              <w:bottom w:w="100" w:type="dxa"/>
+              <w:right w:w="120" w:type="dxa"/>
+            </w:tcMar>
+            <w:vAlign w:val="center"/>
+          </w:tcPr>
+          <w:p>
+            <w:r>
+              <w:rPr>
+                <w:rFonts w:ascii="Calibri" w:eastAsia="Calibri" w:hAnsi="Calibri" w:cs="Calibri"/>
+                <w:color w:val="222222"/>
+              </w:rPr>
+              <w:t xml:space="preserve">Endpoint de identidad</w:t>
+            </w:r>
+          </w:p>
+        </w:tc>
+        <w:tc>
+          <w:tcPr>
+            <w:tcW w:w="0" w:type="auto"/>
+            <w:shd w:val="clear" w:color="auto" w:fill="F2F4F5"/>
+            <w:tcMar>
+              <w:top w:w="100" w:type="dxa"/>
+              <w:left w:w="120" w:type="dxa"/>
+              <w:bottom w:w="100" w:type="dxa"/>
+              <w:right w:w="120" w:type="dxa"/>
+            </w:tcMar>
+            <w:vAlign w:val="center"/>
+          </w:tcPr>
+          <w:p>
+            <w:r>
+              <w:rPr>
+                <w:rFonts w:ascii="Calibri" w:eastAsia="Calibri" w:hAnsi="Calibri" w:cs="Calibri"/>
+                <w:color w:val="222222"/>
+              </w:rPr>
+              <w:t xml:space="preserve">Script PHP (ada_whoami.php) dentro de Moodle</w:t>
+            </w:r>
+          </w:p>
+        </w:tc>
+        <w:tc>
+          <w:tcPr>
+            <w:tcW w:w="0" w:type="auto"/>
+            <w:shd w:val="clear" w:color="auto" w:fill="F2F4F5"/>
+            <w:tcMar>
+              <w:top w:w="100" w:type="dxa"/>
+              <w:left w:w="120" w:type="dxa"/>
+              <w:bottom w:w="100" w:type="dxa"/>
+              <w:right w:w="120" w:type="dxa"/>
+            </w:tcMar>
+            <w:vAlign w:val="center"/>
+          </w:tcPr>
+          <w:p>
+            <w:r>
+              <w:rPr>
+                <w:rFonts w:ascii="Calibri" w:eastAsia="Calibri" w:hAnsi="Calibri" w:cs="Calibri"/>
+                <w:color w:val="222222"/>
+              </w:rPr>
+              <w:t xml:space="preserve">Entrega identificadores seudónimos de cuenta y de sesión; solo responde con sesión autenticada</w:t>
+            </w:r>
+          </w:p>
+        </w:tc>
+      </w:tr>
+      <w:tr>
+        <w:tblPrEx>
+          <w:tblCellMar>
+            <w:top w:w="0" w:type="dxa"/>
+            <w:bottom w:w="0" w:type="dxa"/>
+          </w:tblCellMar>
+        </w:tblPrEx>
+        <w:tc>
+          <w:tcPr>
+            <w:tcW w:w="0" w:type="auto"/>
+            <w:shd w:val="clear" w:color="auto" w:fill="FFFFFF"/>
+            <w:tcMar>
+              <w:top w:w="100" w:type="dxa"/>
+              <w:left w:w="120" w:type="dxa"/>
+              <w:bottom w:w="100" w:type="dxa"/>
+              <w:right w:w="120" w:type="dxa"/>
+            </w:tcMar>
+            <w:vAlign w:val="center"/>
+          </w:tcPr>
+          <w:p>
+            <w:r>
+              <w:rPr>
+                <w:rFonts w:ascii="Calibri" w:eastAsia="Calibri" w:hAnsi="Calibri" w:cs="Calibri"/>
+                <w:color w:val="222222"/>
+              </w:rPr>
+              <w:t xml:space="preserve">Purga automática</w:t>
+            </w:r>
+          </w:p>
+        </w:tc>
+        <w:tc>
+          <w:tcPr>
+            <w:tcW w:w="0" w:type="auto"/>
+            <w:shd w:val="clear" w:color="auto" w:fill="FFFFFF"/>
+            <w:tcMar>
+              <w:top w:w="100" w:type="dxa"/>
+              <w:left w:w="120" w:type="dxa"/>
+              <w:bottom w:w="100" w:type="dxa"/>
+              <w:right w:w="120" w:type="dxa"/>
+            </w:tcMar>
+            <w:vAlign w:val="center"/>
+          </w:tcPr>
+          <w:p>
+            <w:r>
+              <w:rPr>
+                <w:rFonts w:ascii="Calibri" w:eastAsia="Calibri" w:hAnsi="Calibri" w:cs="Calibri"/>
+                <w:color w:val="222222"/>
+              </w:rPr>
+              <w:t xml:space="preserve">Workflow programado de n8n</w:t>
+            </w:r>
+          </w:p>
+        </w:tc>
+        <w:tc>
+          <w:tcPr>
+            <w:tcW w:w="0" w:type="auto"/>
+            <w:shd w:val="clear" w:color="auto" w:fill="FFFFFF"/>
+            <w:tcMar>
+              <w:top w:w="100" w:type="dxa"/>
+              <w:left w:w="120" w:type="dxa"/>
+              <w:bottom w:w="100" w:type="dxa"/>
+              <w:right w:w="120" w:type="dxa"/>
+            </w:tcMar>
+            <w:vAlign w:val="center"/>
+          </w:tcPr>
+          <w:p>
+            <w:r>
+              <w:rPr>
+                <w:rFonts w:ascii="Calibri" w:eastAsia="Calibri" w:hAnsi="Calibri" w:cs="Calibri"/>
+                <w:color w:val="222222"/>
+              </w:rPr>
+              <w:t xml:space="preserve">Elimina cada noche las conversaciones sin actividad por más de 30 días</w:t>
             </w:r>
           </w:p>
         </w:tc>
@@ -1110,27 +1258,7 @@
           <w:sz w:val="22"/>
           <w:szCs w:val="22"/>
         </w:rPr>
-        <w:t xml:space="preserve">Cualquier consulta que no calce con un patrón reconocido se procesa mediante el flujo completo: n8n recupera el historial reciente, consulta el Bridge, construye un </w:t>
-      </w:r>
-      <w:proofErr w:type="spellStart"/>
-      <w:r>
-        <w:rPr>
-          <w:rFonts w:ascii="Calibri" w:eastAsia="Calibri" w:hAnsi="Calibri" w:cs="Calibri"/>
-          <w:color w:val="222222"/>
-          <w:sz w:val="22"/>
-          <w:szCs w:val="22"/>
-        </w:rPr>
-        <w:t>prompt</w:t>
-      </w:r>
-      <w:proofErr w:type="spellEnd"/>
-      <w:r>
-        <w:rPr>
-          <w:rFonts w:ascii="Calibri" w:eastAsia="Calibri" w:hAnsi="Calibri" w:cs="Calibri"/>
-          <w:color w:val="222222"/>
-          <w:sz w:val="22"/>
-          <w:szCs w:val="22"/>
-        </w:rPr>
-        <w:t xml:space="preserve"> estructurado y lo envía a Ollama.</w:t>
+        <w:t xml:space="preserve">Cualquier consulta que no calce con un patrón reconocido se procesa mediante el flujo completo: n8n recupera los últimos mensajes de la conversación actual, consulta el Bridge, construye un prompt estructurado y lo envía a Ollama.</w:t>
       </w:r>
     </w:p>
     <w:p>
@@ -1507,39 +1635,7 @@
                 <w:rFonts w:ascii="Calibri" w:eastAsia="Calibri" w:hAnsi="Calibri" w:cs="Calibri"/>
                 <w:color w:val="222222"/>
               </w:rPr>
-              <w:t>Recibe {</w:t>
-            </w:r>
-            <w:proofErr w:type="spellStart"/>
-            <w:r>
-              <w:rPr>
-                <w:rFonts w:ascii="Calibri" w:eastAsia="Calibri" w:hAnsi="Calibri" w:cs="Calibri"/>
-                <w:color w:val="222222"/>
-              </w:rPr>
-              <w:t>userId</w:t>
-            </w:r>
-            <w:proofErr w:type="spellEnd"/>
-            <w:r>
-              <w:rPr>
-                <w:rFonts w:ascii="Calibri" w:eastAsia="Calibri" w:hAnsi="Calibri" w:cs="Calibri"/>
-                <w:color w:val="222222"/>
-              </w:rPr>
-              <w:t xml:space="preserve">, consulta, </w:t>
-            </w:r>
-            <w:proofErr w:type="spellStart"/>
-            <w:r>
-              <w:rPr>
-                <w:rFonts w:ascii="Calibri" w:eastAsia="Calibri" w:hAnsi="Calibri" w:cs="Calibri"/>
-                <w:color w:val="222222"/>
-              </w:rPr>
-              <w:t>saludoPrevio</w:t>
-            </w:r>
-            <w:proofErr w:type="spellEnd"/>
-            <w:r>
-              <w:rPr>
-                <w:rFonts w:ascii="Calibri" w:eastAsia="Calibri" w:hAnsi="Calibri" w:cs="Calibri"/>
-                <w:color w:val="222222"/>
-              </w:rPr>
-              <w:t>} y devuelve el texto de respuesta</w:t>
+              <w:t xml:space="preserve">Recibe {userId, convId, consulta} y devuelve el texto de respuesta</w:t>
             </w:r>
           </w:p>
         </w:tc>
@@ -1646,6 +1742,154 @@
                 <w:color w:val="222222"/>
               </w:rPr>
               <w:t xml:space="preserve"> construido y devuelve la respuesta generada por el modelo</w:t>
+            </w:r>
+          </w:p>
+        </w:tc>
+      </w:tr>
+      <w:tr>
+        <w:tblPrEx>
+          <w:tblCellMar>
+            <w:top w:w="0" w:type="dxa"/>
+            <w:bottom w:w="0" w:type="dxa"/>
+          </w:tblCellMar>
+        </w:tblPrEx>
+        <w:tc>
+          <w:tcPr>
+            <w:tcW w:w="0" w:type="auto"/>
+            <w:shd w:val="clear" w:color="auto" w:fill="F2F4F5"/>
+            <w:tcMar>
+              <w:top w:w="100" w:type="dxa"/>
+              <w:left w:w="120" w:type="dxa"/>
+              <w:bottom w:w="100" w:type="dxa"/>
+              <w:right w:w="120" w:type="dxa"/>
+            </w:tcMar>
+            <w:vAlign w:val="center"/>
+          </w:tcPr>
+          <w:p>
+            <w:r>
+              <w:rPr>
+                <w:rFonts w:ascii="Calibri" w:eastAsia="Calibri" w:hAnsi="Calibri" w:cs="Calibri"/>
+                <w:color w:val="222222"/>
+              </w:rPr>
+              <w:t xml:space="preserve">/webhook/ada-historial (n8n)</w:t>
+            </w:r>
+          </w:p>
+        </w:tc>
+        <w:tc>
+          <w:tcPr>
+            <w:tcW w:w="0" w:type="auto"/>
+            <w:shd w:val="clear" w:color="auto" w:fill="F2F4F5"/>
+            <w:tcMar>
+              <w:top w:w="100" w:type="dxa"/>
+              <w:left w:w="120" w:type="dxa"/>
+              <w:bottom w:w="100" w:type="dxa"/>
+              <w:right w:w="120" w:type="dxa"/>
+            </w:tcMar>
+            <w:vAlign w:val="center"/>
+          </w:tcPr>
+          <w:p>
+            <w:r>
+              <w:rPr>
+                <w:rFonts w:ascii="Calibri" w:eastAsia="Calibri" w:hAnsi="Calibri" w:cs="Calibri"/>
+                <w:color w:val="222222"/>
+              </w:rPr>
+              <w:t xml:space="preserve">POST</w:t>
+            </w:r>
+          </w:p>
+        </w:tc>
+        <w:tc>
+          <w:tcPr>
+            <w:tcW w:w="0" w:type="auto"/>
+            <w:shd w:val="clear" w:color="auto" w:fill="F2F4F5"/>
+            <w:tcMar>
+              <w:top w:w="100" w:type="dxa"/>
+              <w:left w:w="120" w:type="dxa"/>
+              <w:bottom w:w="100" w:type="dxa"/>
+              <w:right w:w="120" w:type="dxa"/>
+            </w:tcMar>
+            <w:vAlign w:val="center"/>
+          </w:tcPr>
+          <w:p>
+            <w:r>
+              <w:rPr>
+                <w:rFonts w:ascii="Calibri" w:eastAsia="Calibri" w:hAnsi="Calibri" w:cs="Calibri"/>
+                <w:color w:val="222222"/>
+              </w:rPr>
+              <w:t xml:space="preserve">Atiende las acciones del historial: listar, obtener, registrar, borrar y borrar_todo (sección 7)</w:t>
+            </w:r>
+          </w:p>
+        </w:tc>
+      </w:tr>
+      <w:tr>
+        <w:tblPrEx>
+          <w:tblCellMar>
+            <w:top w:w="0" w:type="dxa"/>
+            <w:bottom w:w="0" w:type="dxa"/>
+          </w:tblCellMar>
+        </w:tblPrEx>
+        <w:tc>
+          <w:tcPr>
+            <w:tcW w:w="0" w:type="auto"/>
+            <w:shd w:val="clear" w:color="auto" w:fill="FFFFFF"/>
+            <w:tcMar>
+              <w:top w:w="100" w:type="dxa"/>
+              <w:left w:w="120" w:type="dxa"/>
+              <w:bottom w:w="100" w:type="dxa"/>
+              <w:right w:w="120" w:type="dxa"/>
+            </w:tcMar>
+            <w:vAlign w:val="center"/>
+          </w:tcPr>
+          <w:p>
+            <w:r>
+              <w:rPr>
+                <w:rFonts w:ascii="Calibri" w:eastAsia="Calibri" w:hAnsi="Calibri" w:cs="Calibri"/>
+                <w:color w:val="222222"/>
+              </w:rPr>
+              <w:t xml:space="preserve">/local/ada_whoami.php (Moodle)</w:t>
+            </w:r>
+          </w:p>
+        </w:tc>
+        <w:tc>
+          <w:tcPr>
+            <w:tcW w:w="0" w:type="auto"/>
+            <w:shd w:val="clear" w:color="auto" w:fill="FFFFFF"/>
+            <w:tcMar>
+              <w:top w:w="100" w:type="dxa"/>
+              <w:left w:w="120" w:type="dxa"/>
+              <w:bottom w:w="100" w:type="dxa"/>
+              <w:right w:w="120" w:type="dxa"/>
+            </w:tcMar>
+            <w:vAlign w:val="center"/>
+          </w:tcPr>
+          <w:p>
+            <w:r>
+              <w:rPr>
+                <w:rFonts w:ascii="Calibri" w:eastAsia="Calibri" w:hAnsi="Calibri" w:cs="Calibri"/>
+                <w:color w:val="222222"/>
+              </w:rPr>
+              <w:t xml:space="preserve">GET</w:t>
+            </w:r>
+          </w:p>
+        </w:tc>
+        <w:tc>
+          <w:tcPr>
+            <w:tcW w:w="0" w:type="auto"/>
+            <w:shd w:val="clear" w:color="auto" w:fill="FFFFFF"/>
+            <w:tcMar>
+              <w:top w:w="100" w:type="dxa"/>
+              <w:left w:w="120" w:type="dxa"/>
+              <w:bottom w:w="100" w:type="dxa"/>
+              <w:right w:w="120" w:type="dxa"/>
+            </w:tcMar>
+            <w:vAlign w:val="center"/>
+          </w:tcPr>
+          <w:p>
+            <w:r>
+              <w:rPr>
+                <w:rFonts w:ascii="Calibri" w:eastAsia="Calibri" w:hAnsi="Calibri" w:cs="Calibri"/>
+                <w:color w:val="222222"/>
+              </w:rPr>
+              <w:t xml:space="preserve">Devuelve los identificadores seudónimos de cuenta y de sesión; responde 401 si no hay sesión autenticada</w:t>
             </w:r>
           </w:p>
         </w:tc>
@@ -1748,7 +1992,7 @@
                 <w:sz w:val="22"/>
                 <w:szCs w:val="22"/>
               </w:rPr>
-              <w:t>Seguridad y manejo de datos</w:t>
+              <w:t xml:space="preserve">Seguridad y manejo de datos</w:t>
             </w:r>
           </w:p>
           <w:p>
@@ -1763,7 +2007,7 @@
                 <w:sz w:val="21"/>
                 <w:szCs w:val="21"/>
               </w:rPr>
-              <w:t>•  El modelo de lenguaje se ejecuta localmente (Ollama); ninguna consulta ni dato de curso se envía a un servicio de terceros en la nube.</w:t>
+              <w:t xml:space="preserve">•  El modelo de lenguaje se ejecuta localmente (Ollama); ninguna consulta ni dato de curso se envía a un servicio de terceros en la nube.</w:t>
             </w:r>
           </w:p>
           <w:p>
@@ -1778,7 +2022,7 @@
                 <w:sz w:val="21"/>
                 <w:szCs w:val="21"/>
               </w:rPr>
-              <w:t>•  El widget solo se activa con sesión de Moodle iniciada, verificada mediante la presencia del enlace de cierre de sesión en la interfaz.</w:t>
+              <w:t xml:space="preserve">•  El widget solo se activa con sesión de Moodle iniciada, verificada mediante la presencia del enlace de cierre de sesión en la interfaz.</w:t>
             </w:r>
           </w:p>
           <w:p>
@@ -1793,7 +2037,22 @@
                 <w:sz w:val="21"/>
                 <w:szCs w:val="21"/>
               </w:rPr>
-              <w:t>•  El Bridge expone únicamente metadatos de cursos, nunca datos personales ni calificaciones.</w:t>
+              <w:t xml:space="preserve">•  El Bridge expone únicamente metadatos de cursos, nunca datos personales ni calificaciones.</w:t>
+            </w:r>
+          </w:p>
+          <w:p>
+            <w:pPr>
+              <w:spacing w:after="40" w:line="264" w:lineRule="auto"/>
+              <w:jc w:val="both"/>
+            </w:pPr>
+            <w:r>
+              <w:rPr>
+                <w:rFonts w:ascii="Calibri" w:eastAsia="Calibri" w:hAnsi="Calibri" w:cs="Calibri"/>
+                <w:color w:val="333333"/>
+                <w:sz w:val="21"/>
+                <w:szCs w:val="21"/>
+              </w:rPr>
+              <w:t xml:space="preserve">•  El historial de conversaciones se asocia a identificadores seudónimos (no a nombre ni correo) y se elimina automáticamente a los 30 días sin actividad (sección 7).</w:t>
             </w:r>
           </w:p>
         </w:tc>
@@ -1821,7 +2080,6 @@
           <w:sz w:val="30"/>
           <w:szCs w:val="30"/>
         </w:rPr>
-        <w:lastRenderedPageBreak/>
         <w:t xml:space="preserve">7.  </w:t>
       </w:r>
       <w:r>
@@ -1833,7 +2091,1280 @@
           <w:sz w:val="30"/>
           <w:szCs w:val="30"/>
         </w:rPr>
-        <w:t>Límites y consideraciones de escalabilidad</w:t>
+        <w:t xml:space="preserve">Gestión de sesión e historial de conversaciones</w:t>
+      </w:r>
+    </w:p>
+    <w:p>
+      <w:pPr>
+        <w:spacing w:after="160" w:line="288" w:lineRule="auto"/>
+        <w:jc w:val="both"/>
+      </w:pPr>
+      <w:r>
+        <w:rPr>
+          <w:rFonts w:ascii="Calibri" w:eastAsia="Calibri" w:hAnsi="Calibri" w:cs="Calibri"/>
+          <w:color w:val="222222"/>
+          <w:sz w:val="22"/>
+          <w:szCs w:val="22"/>
+        </w:rPr>
+        <w:t xml:space="preserve">Ada distingue entre el chat actual y el historial de conversaciones. Mientras la sesión de Moodle sea la misma, la conversación en curso se conserva (aunque el estudiante recargue la página o navegue por Moodle). Cuando inicia una sesión nueva, Ada abre un chat vacío y la conversación anterior queda guardada en el historial, desde donde el estudiante puede consultarla, retomarla o eliminarla.</w:t>
+      </w:r>
+    </w:p>
+    <w:p>
+      <w:pPr>
+        <w:pStyle w:val="Ttulo2"/>
+        <w:spacing w:before="320" w:after="140"/>
+      </w:pPr>
+      <w:r>
+        <w:rPr>
+          <w:rFonts w:ascii="Calibri" w:eastAsia="Calibri" w:hAnsi="Calibri" w:cs="Calibri"/>
+          <w:b/>
+          <w:bCs/>
+          <w:color w:val="4E95C2"/>
+          <w:sz w:val="24"/>
+          <w:szCs w:val="24"/>
+        </w:rPr>
+        <w:t xml:space="preserve">Identidad seudónima</w:t>
+      </w:r>
+    </w:p>
+    <w:p>
+      <w:pPr>
+        <w:spacing w:after="160" w:line="288" w:lineRule="auto"/>
+        <w:jc w:val="both"/>
+      </w:pPr>
+      <w:r>
+        <w:rPr>
+          <w:rFonts w:ascii="Calibri" w:eastAsia="Calibri" w:hAnsi="Calibri" w:cs="Calibri"/>
+          <w:color w:val="222222"/>
+          <w:sz w:val="22"/>
+          <w:szCs w:val="22"/>
+        </w:rPr>
+        <w:t xml:space="preserve">El endpoint /local/ada_whoami.php, alojado en Moodle, responde únicamente cuando existe una sesión autenticada (nunca a invitados) y entrega dos valores calculados con HMAC-SHA256 y un secreto del servidor: uid, que identifica la cuenta y separa el historial de cada usuario, y sid, que identifica la sesión y cambia en cada inicio de sesión. Ninguno permite recuperar el nombre, el correo ni el documento del usuario.</w:t>
+      </w:r>
+    </w:p>
+    <w:p>
+      <w:pPr>
+        <w:pStyle w:val="Ttulo2"/>
+        <w:spacing w:before="320" w:after="140"/>
+      </w:pPr>
+      <w:r>
+        <w:rPr>
+          <w:rFonts w:ascii="Calibri" w:eastAsia="Calibri" w:hAnsi="Calibri" w:cs="Calibri"/>
+          <w:b/>
+          <w:bCs/>
+          <w:color w:val="4E95C2"/>
+          <w:sz w:val="24"/>
+          <w:szCs w:val="24"/>
+        </w:rPr>
+        <w:t xml:space="preserve">Chat actual y detección de sesión nueva</w:t>
+      </w:r>
+    </w:p>
+    <w:p>
+      <w:pPr>
+        <w:spacing w:after="160" w:line="288" w:lineRule="auto"/>
+        <w:jc w:val="both"/>
+      </w:pPr>
+      <w:r>
+        <w:rPr>
+          <w:rFonts w:ascii="Calibri" w:eastAsia="Calibri" w:hAnsi="Calibri" w:cs="Calibri"/>
+          <w:color w:val="222222"/>
+          <w:sz w:val="22"/>
+          <w:szCs w:val="22"/>
+        </w:rPr>
+        <w:t xml:space="preserve">El widget guarda el chat en curso en el almacenamiento local del navegador, con una clave por cuenta, junto con el sid. Al cargar cada página compara el sid: si coincide, restaura el chat; si cambió, abre una conversación vacía. La copia local se elimina al cerrar sesión y cuando otra cuenta usa el mismo navegador.</w:t>
+      </w:r>
+    </w:p>
+    <w:p>
+      <w:pPr>
+        <w:pStyle w:val="Ttulo2"/>
+        <w:spacing w:before="320" w:after="140"/>
+      </w:pPr>
+      <w:r>
+        <w:rPr>
+          <w:rFonts w:ascii="Calibri" w:eastAsia="Calibri" w:hAnsi="Calibri" w:cs="Calibri"/>
+          <w:b/>
+          <w:bCs/>
+          <w:color w:val="4E95C2"/>
+          <w:sz w:val="24"/>
+          <w:szCs w:val="24"/>
+        </w:rPr>
+        <w:t xml:space="preserve">Almacenamiento y contexto del modelo</w:t>
+      </w:r>
+    </w:p>
+    <w:p>
+      <w:pPr>
+        <w:spacing w:after="160" w:line="288" w:lineRule="auto"/>
+        <w:jc w:val="both"/>
+      </w:pPr>
+      <w:r>
+        <w:rPr>
+          <w:rFonts w:ascii="Calibri" w:eastAsia="Calibri" w:hAnsi="Calibri" w:cs="Calibri"/>
+          <w:color w:val="222222"/>
+          <w:sz w:val="22"/>
+          <w:szCs w:val="22"/>
+        </w:rPr>
+        <w:t xml:space="preserve">Cada conversación es un archivo JSON dentro de una carpeta por usuario, en el volumen persistente de n8n (/home/node/.n8n/historial/&lt;uid&gt;/&lt;convId&gt;.json), con un máximo de 200 mensajes. Al modelo solo se le envían los últimos mensajes de la conversación actual, nunca las anteriores; si el estudiante retoma una, esa pasa a ser la actual. Los saludos y las preguntas factuales que el widget resuelve sin el modelo también se registran para que aparezcan en el historial.</w:t>
+      </w:r>
+    </w:p>
+    <w:p>
+      <w:pPr>
+        <w:pStyle w:val="Ttulo2"/>
+        <w:spacing w:before="320" w:after="140"/>
+      </w:pPr>
+      <w:r>
+        <w:rPr>
+          <w:rFonts w:ascii="Calibri" w:eastAsia="Calibri" w:hAnsi="Calibri" w:cs="Calibri"/>
+          <w:b/>
+          <w:bCs/>
+          <w:color w:val="4E95C2"/>
+          <w:sz w:val="24"/>
+          <w:szCs w:val="24"/>
+        </w:rPr>
+        <w:t xml:space="preserve">Operaciones del historial</w:t>
+      </w:r>
+    </w:p>
+    <w:p>
+      <w:pPr>
+        <w:spacing w:after="160" w:line="288" w:lineRule="auto"/>
+        <w:jc w:val="both"/>
+      </w:pPr>
+      <w:r>
+        <w:rPr>
+          <w:rFonts w:ascii="Calibri" w:eastAsia="Calibri" w:hAnsi="Calibri" w:cs="Calibri"/>
+          <w:color w:val="222222"/>
+          <w:sz w:val="22"/>
+          <w:szCs w:val="22"/>
+        </w:rPr>
+        <w:t xml:space="preserve">Todas se atienden en el webhook /webhook/ada-historial de n8n, con el parámetro accion:</w:t>
+      </w:r>
+    </w:p>
+    <w:tbl>
+      <w:tblPr>
+        <w:tblW w:w="5000" w:type="pct"/>
+        <w:tblBorders>
+          <w:top w:val="single" w:sz="4" w:space="0" w:color="C9D2D6"/>
+          <w:left w:val="single" w:sz="4" w:space="0" w:color="C9D2D6"/>
+          <w:bottom w:val="single" w:sz="4" w:space="0" w:color="C9D2D6"/>
+          <w:right w:val="single" w:sz="4" w:space="0" w:color="C9D2D6"/>
+          <w:insideH w:val="single" w:sz="2" w:space="0" w:color="C9D2D6"/>
+          <w:insideV w:val="single" w:sz="2" w:space="0" w:color="C9D2D6"/>
+        </w:tblBorders>
+        <w:tblCellMar>
+          <w:left w:w="10" w:type="dxa"/>
+          <w:right w:w="10" w:type="dxa"/>
+        </w:tblCellMar>
+        <w:tblLook w:val="04A0" w:firstRow="1" w:lastRow="0" w:firstColumn="1" w:lastColumn="0" w:noHBand="0" w:noVBand="1"/>
+      </w:tblPr>
+      <w:tblGrid>
+        <w:gridCol w:w="1700"/>
+        <w:gridCol w:w="2300"/>
+        <w:gridCol w:w="5000"/>
+      </w:tblGrid>
+      <w:tr>
+        <w:trPr>
+          <w:tblHeader/>
+        </w:trPr>
+        <w:tc>
+          <w:tcPr>
+            <w:tcW w:w="1700" w:type="dxa"/>
+            <w:shd w:val="clear" w:color="auto" w:fill="24425E"/>
+            <w:tcMar>
+              <w:top w:w="100" w:type="dxa"/>
+              <w:left w:w="120" w:type="dxa"/>
+              <w:bottom w:w="100" w:type="dxa"/>
+              <w:right w:w="120" w:type="dxa"/>
+            </w:tcMar>
+            <w:vAlign w:val="center"/>
+          </w:tcPr>
+          <w:p>
+            <w:r>
+              <w:rPr>
+                <w:rFonts w:ascii="Calibri" w:eastAsia="Calibri" w:hAnsi="Calibri" w:cs="Calibri"/>
+                <w:b/>
+                <w:bCs/>
+                <w:color w:val="FFFFFF"/>
+                <w:sz w:val="20"/>
+                <w:szCs w:val="20"/>
+              </w:rPr>
+              <w:t xml:space="preserve">Acción</w:t>
+            </w:r>
+          </w:p>
+        </w:tc>
+        <w:tc>
+          <w:tcPr>
+            <w:tcW w:w="2300" w:type="dxa"/>
+            <w:shd w:val="clear" w:color="auto" w:fill="24425E"/>
+            <w:tcMar>
+              <w:top w:w="100" w:type="dxa"/>
+              <w:left w:w="120" w:type="dxa"/>
+              <w:bottom w:w="100" w:type="dxa"/>
+              <w:right w:w="120" w:type="dxa"/>
+            </w:tcMar>
+            <w:vAlign w:val="center"/>
+          </w:tcPr>
+          <w:p>
+            <w:r>
+              <w:rPr>
+                <w:rFonts w:ascii="Calibri" w:eastAsia="Calibri" w:hAnsi="Calibri" w:cs="Calibri"/>
+                <w:b/>
+                <w:bCs/>
+                <w:color w:val="FFFFFF"/>
+                <w:sz w:val="20"/>
+                <w:szCs w:val="20"/>
+              </w:rPr>
+              <w:t xml:space="preserve">Parámetros</w:t>
+            </w:r>
+          </w:p>
+        </w:tc>
+        <w:tc>
+          <w:tcPr>
+            <w:tcW w:w="5000" w:type="dxa"/>
+            <w:shd w:val="clear" w:color="auto" w:fill="24425E"/>
+            <w:tcMar>
+              <w:top w:w="100" w:type="dxa"/>
+              <w:left w:w="120" w:type="dxa"/>
+              <w:bottom w:w="100" w:type="dxa"/>
+              <w:right w:w="120" w:type="dxa"/>
+            </w:tcMar>
+            <w:vAlign w:val="center"/>
+          </w:tcPr>
+          <w:p>
+            <w:r>
+              <w:rPr>
+                <w:rFonts w:ascii="Calibri" w:eastAsia="Calibri" w:hAnsi="Calibri" w:cs="Calibri"/>
+                <w:b/>
+                <w:bCs/>
+                <w:color w:val="FFFFFF"/>
+                <w:sz w:val="20"/>
+                <w:szCs w:val="20"/>
+              </w:rPr>
+              <w:t xml:space="preserve">Efecto</w:t>
+            </w:r>
+          </w:p>
+        </w:tc>
+      </w:tr>
+      <w:tr>
+        <w:trPr>
+          <w:cantSplit/>
+        </w:trPr>
+        <w:tc>
+          <w:tcPr>
+            <w:tcW w:w="1700" w:type="dxa"/>
+            <w:shd w:val="clear" w:color="auto" w:fill="FFFFFF"/>
+            <w:tcMar>
+              <w:top w:w="100" w:type="dxa"/>
+              <w:left w:w="120" w:type="dxa"/>
+              <w:bottom w:w="100" w:type="dxa"/>
+              <w:right w:w="120" w:type="dxa"/>
+            </w:tcMar>
+            <w:vAlign w:val="center"/>
+          </w:tcPr>
+          <w:p>
+            <w:r>
+              <w:rPr>
+                <w:rFonts w:ascii="Calibri" w:eastAsia="Calibri" w:hAnsi="Calibri" w:cs="Calibri"/>
+                <w:b/>
+                <w:bCs/>
+                <w:color w:val="222222"/>
+                <w:sz w:val="20"/>
+                <w:szCs w:val="20"/>
+              </w:rPr>
+              <w:t xml:space="preserve">listar</w:t>
+            </w:r>
+          </w:p>
+        </w:tc>
+        <w:tc>
+          <w:tcPr>
+            <w:tcW w:w="2300" w:type="dxa"/>
+            <w:shd w:val="clear" w:color="auto" w:fill="FFFFFF"/>
+            <w:tcMar>
+              <w:top w:w="100" w:type="dxa"/>
+              <w:left w:w="120" w:type="dxa"/>
+              <w:bottom w:w="100" w:type="dxa"/>
+              <w:right w:w="120" w:type="dxa"/>
+            </w:tcMar>
+            <w:vAlign w:val="center"/>
+          </w:tcPr>
+          <w:p>
+            <w:r>
+              <w:rPr>
+                <w:rFonts w:ascii="Calibri" w:eastAsia="Calibri" w:hAnsi="Calibri" w:cs="Calibri"/>
+                <w:color w:val="222222"/>
+                <w:sz w:val="20"/>
+                <w:szCs w:val="20"/>
+              </w:rPr>
+              <w:t xml:space="preserve">uid</w:t>
+            </w:r>
+          </w:p>
+        </w:tc>
+        <w:tc>
+          <w:tcPr>
+            <w:tcW w:w="5000" w:type="dxa"/>
+            <w:shd w:val="clear" w:color="auto" w:fill="FFFFFF"/>
+            <w:tcMar>
+              <w:top w:w="100" w:type="dxa"/>
+              <w:left w:w="120" w:type="dxa"/>
+              <w:bottom w:w="100" w:type="dxa"/>
+              <w:right w:w="120" w:type="dxa"/>
+            </w:tcMar>
+            <w:vAlign w:val="center"/>
+          </w:tcPr>
+          <w:p>
+            <w:r>
+              <w:rPr>
+                <w:rFonts w:ascii="Calibri" w:eastAsia="Calibri" w:hAnsi="Calibri" w:cs="Calibri"/>
+                <w:color w:val="222222"/>
+                <w:sz w:val="20"/>
+                <w:szCs w:val="20"/>
+              </w:rPr>
+              <w:t xml:space="preserve">Devuelve las conversaciones del usuario (título, fecha y número de mensajes), de la más reciente a la más antigua</w:t>
+            </w:r>
+          </w:p>
+        </w:tc>
+      </w:tr>
+      <w:tr>
+        <w:trPr>
+          <w:cantSplit/>
+        </w:trPr>
+        <w:tc>
+          <w:tcPr>
+            <w:tcW w:w="1700" w:type="dxa"/>
+            <w:shd w:val="clear" w:color="auto" w:fill="F2F4F5"/>
+            <w:tcMar>
+              <w:top w:w="100" w:type="dxa"/>
+              <w:left w:w="120" w:type="dxa"/>
+              <w:bottom w:w="100" w:type="dxa"/>
+              <w:right w:w="120" w:type="dxa"/>
+            </w:tcMar>
+            <w:vAlign w:val="center"/>
+          </w:tcPr>
+          <w:p>
+            <w:r>
+              <w:rPr>
+                <w:rFonts w:ascii="Calibri" w:eastAsia="Calibri" w:hAnsi="Calibri" w:cs="Calibri"/>
+                <w:b/>
+                <w:bCs/>
+                <w:color w:val="222222"/>
+                <w:sz w:val="20"/>
+                <w:szCs w:val="20"/>
+              </w:rPr>
+              <w:t xml:space="preserve">obtener</w:t>
+            </w:r>
+          </w:p>
+        </w:tc>
+        <w:tc>
+          <w:tcPr>
+            <w:tcW w:w="2300" w:type="dxa"/>
+            <w:shd w:val="clear" w:color="auto" w:fill="F2F4F5"/>
+            <w:tcMar>
+              <w:top w:w="100" w:type="dxa"/>
+              <w:left w:w="120" w:type="dxa"/>
+              <w:bottom w:w="100" w:type="dxa"/>
+              <w:right w:w="120" w:type="dxa"/>
+            </w:tcMar>
+            <w:vAlign w:val="center"/>
+          </w:tcPr>
+          <w:p>
+            <w:r>
+              <w:rPr>
+                <w:rFonts w:ascii="Calibri" w:eastAsia="Calibri" w:hAnsi="Calibri" w:cs="Calibri"/>
+                <w:color w:val="222222"/>
+                <w:sz w:val="20"/>
+                <w:szCs w:val="20"/>
+              </w:rPr>
+              <w:t xml:space="preserve">uid, convId</w:t>
+            </w:r>
+          </w:p>
+        </w:tc>
+        <w:tc>
+          <w:tcPr>
+            <w:tcW w:w="5000" w:type="dxa"/>
+            <w:shd w:val="clear" w:color="auto" w:fill="F2F4F5"/>
+            <w:tcMar>
+              <w:top w:w="100" w:type="dxa"/>
+              <w:left w:w="120" w:type="dxa"/>
+              <w:bottom w:w="100" w:type="dxa"/>
+              <w:right w:w="120" w:type="dxa"/>
+            </w:tcMar>
+            <w:vAlign w:val="center"/>
+          </w:tcPr>
+          <w:p>
+            <w:r>
+              <w:rPr>
+                <w:rFonts w:ascii="Calibri" w:eastAsia="Calibri" w:hAnsi="Calibri" w:cs="Calibri"/>
+                <w:color w:val="222222"/>
+                <w:sz w:val="20"/>
+                <w:szCs w:val="20"/>
+              </w:rPr>
+              <w:t xml:space="preserve">Devuelve los mensajes de una conversación (para retomarla)</w:t>
+            </w:r>
+          </w:p>
+        </w:tc>
+      </w:tr>
+      <w:tr>
+        <w:trPr>
+          <w:cantSplit/>
+        </w:trPr>
+        <w:tc>
+          <w:tcPr>
+            <w:tcW w:w="1700" w:type="dxa"/>
+            <w:shd w:val="clear" w:color="auto" w:fill="FFFFFF"/>
+            <w:tcMar>
+              <w:top w:w="100" w:type="dxa"/>
+              <w:left w:w="120" w:type="dxa"/>
+              <w:bottom w:w="100" w:type="dxa"/>
+              <w:right w:w="120" w:type="dxa"/>
+            </w:tcMar>
+            <w:vAlign w:val="center"/>
+          </w:tcPr>
+          <w:p>
+            <w:r>
+              <w:rPr>
+                <w:rFonts w:ascii="Calibri" w:eastAsia="Calibri" w:hAnsi="Calibri" w:cs="Calibri"/>
+                <w:b/>
+                <w:bCs/>
+                <w:color w:val="222222"/>
+                <w:sz w:val="20"/>
+                <w:szCs w:val="20"/>
+              </w:rPr>
+              <w:t xml:space="preserve">registrar</w:t>
+            </w:r>
+          </w:p>
+        </w:tc>
+        <w:tc>
+          <w:tcPr>
+            <w:tcW w:w="2300" w:type="dxa"/>
+            <w:shd w:val="clear" w:color="auto" w:fill="FFFFFF"/>
+            <w:tcMar>
+              <w:top w:w="100" w:type="dxa"/>
+              <w:left w:w="120" w:type="dxa"/>
+              <w:bottom w:w="100" w:type="dxa"/>
+              <w:right w:w="120" w:type="dxa"/>
+            </w:tcMar>
+            <w:vAlign w:val="center"/>
+          </w:tcPr>
+          <w:p>
+            <w:r>
+              <w:rPr>
+                <w:rFonts w:ascii="Calibri" w:eastAsia="Calibri" w:hAnsi="Calibri" w:cs="Calibri"/>
+                <w:color w:val="222222"/>
+                <w:sz w:val="20"/>
+                <w:szCs w:val="20"/>
+              </w:rPr>
+              <w:t xml:space="preserve">uid, convId, mensajes</w:t>
+            </w:r>
+          </w:p>
+        </w:tc>
+        <w:tc>
+          <w:tcPr>
+            <w:tcW w:w="5000" w:type="dxa"/>
+            <w:shd w:val="clear" w:color="auto" w:fill="FFFFFF"/>
+            <w:tcMar>
+              <w:top w:w="100" w:type="dxa"/>
+              <w:left w:w="120" w:type="dxa"/>
+              <w:bottom w:w="100" w:type="dxa"/>
+              <w:right w:w="120" w:type="dxa"/>
+            </w:tcMar>
+            <w:vAlign w:val="center"/>
+          </w:tcPr>
+          <w:p>
+            <w:r>
+              <w:rPr>
+                <w:rFonts w:ascii="Calibri" w:eastAsia="Calibri" w:hAnsi="Calibri" w:cs="Calibri"/>
+                <w:color w:val="222222"/>
+                <w:sz w:val="20"/>
+                <w:szCs w:val="20"/>
+              </w:rPr>
+              <w:t xml:space="preserve">Guarda los intercambios resueltos sin el modelo (saludos y preguntas factuales)</w:t>
+            </w:r>
+          </w:p>
+        </w:tc>
+      </w:tr>
+      <w:tr>
+        <w:trPr>
+          <w:cantSplit/>
+        </w:trPr>
+        <w:tc>
+          <w:tcPr>
+            <w:tcW w:w="1700" w:type="dxa"/>
+            <w:shd w:val="clear" w:color="auto" w:fill="F2F4F5"/>
+            <w:tcMar>
+              <w:top w:w="100" w:type="dxa"/>
+              <w:left w:w="120" w:type="dxa"/>
+              <w:bottom w:w="100" w:type="dxa"/>
+              <w:right w:w="120" w:type="dxa"/>
+            </w:tcMar>
+            <w:vAlign w:val="center"/>
+          </w:tcPr>
+          <w:p>
+            <w:r>
+              <w:rPr>
+                <w:rFonts w:ascii="Calibri" w:eastAsia="Calibri" w:hAnsi="Calibri" w:cs="Calibri"/>
+                <w:b/>
+                <w:bCs/>
+                <w:color w:val="222222"/>
+                <w:sz w:val="20"/>
+                <w:szCs w:val="20"/>
+              </w:rPr>
+              <w:t xml:space="preserve">borrar</w:t>
+            </w:r>
+          </w:p>
+        </w:tc>
+        <w:tc>
+          <w:tcPr>
+            <w:tcW w:w="2300" w:type="dxa"/>
+            <w:shd w:val="clear" w:color="auto" w:fill="F2F4F5"/>
+            <w:tcMar>
+              <w:top w:w="100" w:type="dxa"/>
+              <w:left w:w="120" w:type="dxa"/>
+              <w:bottom w:w="100" w:type="dxa"/>
+              <w:right w:w="120" w:type="dxa"/>
+            </w:tcMar>
+            <w:vAlign w:val="center"/>
+          </w:tcPr>
+          <w:p>
+            <w:r>
+              <w:rPr>
+                <w:rFonts w:ascii="Calibri" w:eastAsia="Calibri" w:hAnsi="Calibri" w:cs="Calibri"/>
+                <w:color w:val="222222"/>
+                <w:sz w:val="20"/>
+                <w:szCs w:val="20"/>
+              </w:rPr>
+              <w:t xml:space="preserve">uid, convId</w:t>
+            </w:r>
+          </w:p>
+        </w:tc>
+        <w:tc>
+          <w:tcPr>
+            <w:tcW w:w="5000" w:type="dxa"/>
+            <w:shd w:val="clear" w:color="auto" w:fill="F2F4F5"/>
+            <w:tcMar>
+              <w:top w:w="100" w:type="dxa"/>
+              <w:left w:w="120" w:type="dxa"/>
+              <w:bottom w:w="100" w:type="dxa"/>
+              <w:right w:w="120" w:type="dxa"/>
+            </w:tcMar>
+            <w:vAlign w:val="center"/>
+          </w:tcPr>
+          <w:p>
+            <w:r>
+              <w:rPr>
+                <w:rFonts w:ascii="Calibri" w:eastAsia="Calibri" w:hAnsi="Calibri" w:cs="Calibri"/>
+                <w:color w:val="222222"/>
+                <w:sz w:val="20"/>
+                <w:szCs w:val="20"/>
+              </w:rPr>
+              <w:t xml:space="preserve">Elimina una conversación</w:t>
+            </w:r>
+          </w:p>
+        </w:tc>
+      </w:tr>
+      <w:tr>
+        <w:trPr>
+          <w:cantSplit/>
+        </w:trPr>
+        <w:tc>
+          <w:tcPr>
+            <w:tcW w:w="1700" w:type="dxa"/>
+            <w:shd w:val="clear" w:color="auto" w:fill="FFFFFF"/>
+            <w:tcMar>
+              <w:top w:w="100" w:type="dxa"/>
+              <w:left w:w="120" w:type="dxa"/>
+              <w:bottom w:w="100" w:type="dxa"/>
+              <w:right w:w="120" w:type="dxa"/>
+            </w:tcMar>
+            <w:vAlign w:val="center"/>
+          </w:tcPr>
+          <w:p>
+            <w:r>
+              <w:rPr>
+                <w:rFonts w:ascii="Calibri" w:eastAsia="Calibri" w:hAnsi="Calibri" w:cs="Calibri"/>
+                <w:b/>
+                <w:bCs/>
+                <w:color w:val="222222"/>
+                <w:sz w:val="20"/>
+                <w:szCs w:val="20"/>
+              </w:rPr>
+              <w:t xml:space="preserve">borrar_todo</w:t>
+            </w:r>
+          </w:p>
+        </w:tc>
+        <w:tc>
+          <w:tcPr>
+            <w:tcW w:w="2300" w:type="dxa"/>
+            <w:shd w:val="clear" w:color="auto" w:fill="FFFFFF"/>
+            <w:tcMar>
+              <w:top w:w="100" w:type="dxa"/>
+              <w:left w:w="120" w:type="dxa"/>
+              <w:bottom w:w="100" w:type="dxa"/>
+              <w:right w:w="120" w:type="dxa"/>
+            </w:tcMar>
+            <w:vAlign w:val="center"/>
+          </w:tcPr>
+          <w:p>
+            <w:r>
+              <w:rPr>
+                <w:rFonts w:ascii="Calibri" w:eastAsia="Calibri" w:hAnsi="Calibri" w:cs="Calibri"/>
+                <w:color w:val="222222"/>
+                <w:sz w:val="20"/>
+                <w:szCs w:val="20"/>
+              </w:rPr>
+              <w:t xml:space="preserve">uid</w:t>
+            </w:r>
+          </w:p>
+        </w:tc>
+        <w:tc>
+          <w:tcPr>
+            <w:tcW w:w="5000" w:type="dxa"/>
+            <w:shd w:val="clear" w:color="auto" w:fill="FFFFFF"/>
+            <w:tcMar>
+              <w:top w:w="100" w:type="dxa"/>
+              <w:left w:w="120" w:type="dxa"/>
+              <w:bottom w:w="100" w:type="dxa"/>
+              <w:right w:w="120" w:type="dxa"/>
+            </w:tcMar>
+            <w:vAlign w:val="center"/>
+          </w:tcPr>
+          <w:p>
+            <w:r>
+              <w:rPr>
+                <w:rFonts w:ascii="Calibri" w:eastAsia="Calibri" w:hAnsi="Calibri" w:cs="Calibri"/>
+                <w:color w:val="222222"/>
+                <w:sz w:val="20"/>
+                <w:szCs w:val="20"/>
+              </w:rPr>
+              <w:t xml:space="preserve">Elimina todo el historial del usuario</w:t>
+            </w:r>
+          </w:p>
+        </w:tc>
+      </w:tr>
+    </w:tbl>
+    <w:p>
+      <w:pPr>
+        <w:spacing w:after="160" w:line="288" w:lineRule="auto"/>
+        <w:jc w:val="both"/>
+      </w:pPr>
+      <w:r>
+        <w:rPr>
+          <w:rFonts w:ascii="Calibri" w:eastAsia="Calibri" w:hAnsi="Calibri" w:cs="Calibri"/>
+          <w:color w:val="222222"/>
+          <w:sz w:val="22"/>
+          <w:szCs w:val="22"/>
+        </w:rPr>
+        <w:t xml:space="preserve">Los identificadores se validan con expresiones estrictas (uid: 32 caracteres hexadecimales; convId: prefijo c_ seguido de caracteres alfanuméricos) para impedir el acceso a rutas arbitrarias del sistema de archivos.</w:t>
+      </w:r>
+    </w:p>
+    <w:p>
+      <w:pPr>
+        <w:pStyle w:val="Ttulo2"/>
+        <w:spacing w:before="320" w:after="140"/>
+      </w:pPr>
+      <w:r>
+        <w:rPr>
+          <w:rFonts w:ascii="Calibri" w:eastAsia="Calibri" w:hAnsi="Calibri" w:cs="Calibri"/>
+          <w:b/>
+          <w:bCs/>
+          <w:color w:val="4E95C2"/>
+          <w:sz w:val="24"/>
+          <w:szCs w:val="24"/>
+        </w:rPr>
+        <w:t xml:space="preserve">Purga automática</w:t>
+      </w:r>
+    </w:p>
+    <w:p>
+      <w:pPr>
+        <w:spacing w:after="160" w:line="288" w:lineRule="auto"/>
+        <w:jc w:val="both"/>
+      </w:pPr>
+      <w:r>
+        <w:rPr>
+          <w:rFonts w:ascii="Calibri" w:eastAsia="Calibri" w:hAnsi="Calibri" w:cs="Calibri"/>
+          <w:color w:val="222222"/>
+          <w:sz w:val="22"/>
+          <w:szCs w:val="22"/>
+        </w:rPr>
+        <w:t xml:space="preserve">El workflow «Ada - Purga automatica de historial» se ejecuta cada noche a las 03:00 y elimina los archivos sin actividad (según su fecha de última modificación) por más de 30 días, tanto en la carpeta actual como en la del formato anterior (conversaciones). El plazo se cambia en la constante DIAS_RETENCION del nodo de código. El workflow incluye un disparador manual para pruebas.</w:t>
+      </w:r>
+    </w:p>
+    <w:p>
+      <w:pPr>
+        <w:pStyle w:val="Ttulo2"/>
+        <w:spacing w:before="320" w:after="140"/>
+      </w:pPr>
+      <w:r>
+        <w:rPr>
+          <w:rFonts w:ascii="Calibri" w:eastAsia="Calibri" w:hAnsi="Calibri" w:cs="Calibri"/>
+          <w:b/>
+          <w:bCs/>
+          <w:color w:val="4E95C2"/>
+          <w:sz w:val="24"/>
+          <w:szCs w:val="24"/>
+        </w:rPr>
+        <w:t xml:space="preserve">Tratamiento de los datos</w:t>
+      </w:r>
+    </w:p>
+    <w:p>
+      <w:pPr>
+        <w:spacing w:after="160" w:line="288" w:lineRule="auto"/>
+        <w:jc w:val="both"/>
+      </w:pPr>
+      <w:r>
+        <w:rPr>
+          <w:rFonts w:ascii="Calibri" w:eastAsia="Calibri" w:hAnsi="Calibri" w:cs="Calibri"/>
+          <w:color w:val="222222"/>
+          <w:sz w:val="22"/>
+          <w:szCs w:val="22"/>
+        </w:rPr>
+        <w:t xml:space="preserve">La siguiente tabla resume qué se almacena, dónde, con qué finalidad, por cuánto tiempo, quién accede, cómo se elimina y qué medidas de protección se aplican.</w:t>
+      </w:r>
+    </w:p>
+    <w:tbl>
+      <w:tblPr>
+        <w:tblW w:w="5000" w:type="pct"/>
+        <w:tblBorders>
+          <w:top w:val="single" w:sz="4" w:space="0" w:color="C9D2D6"/>
+          <w:left w:val="single" w:sz="4" w:space="0" w:color="C9D2D6"/>
+          <w:bottom w:val="single" w:sz="4" w:space="0" w:color="C9D2D6"/>
+          <w:right w:val="single" w:sz="4" w:space="0" w:color="C9D2D6"/>
+          <w:insideH w:val="single" w:sz="2" w:space="0" w:color="C9D2D6"/>
+          <w:insideV w:val="single" w:sz="2" w:space="0" w:color="C9D2D6"/>
+        </w:tblBorders>
+        <w:tblCellMar>
+          <w:left w:w="10" w:type="dxa"/>
+          <w:right w:w="10" w:type="dxa"/>
+        </w:tblCellMar>
+        <w:tblLook w:val="04A0" w:firstRow="1" w:lastRow="0" w:firstColumn="1" w:lastColumn="0" w:noHBand="0" w:noVBand="1"/>
+      </w:tblPr>
+      <w:tblGrid>
+        <w:gridCol w:w="2200"/>
+        <w:gridCol w:w="6800"/>
+      </w:tblGrid>
+      <w:tr>
+        <w:trPr>
+          <w:tblHeader/>
+        </w:trPr>
+        <w:tc>
+          <w:tcPr>
+            <w:tcW w:w="2200" w:type="dxa"/>
+            <w:shd w:val="clear" w:color="auto" w:fill="24425E"/>
+            <w:tcMar>
+              <w:top w:w="100" w:type="dxa"/>
+              <w:left w:w="120" w:type="dxa"/>
+              <w:bottom w:w="100" w:type="dxa"/>
+              <w:right w:w="120" w:type="dxa"/>
+            </w:tcMar>
+            <w:vAlign w:val="center"/>
+          </w:tcPr>
+          <w:p>
+            <w:r>
+              <w:rPr>
+                <w:rFonts w:ascii="Calibri" w:eastAsia="Calibri" w:hAnsi="Calibri" w:cs="Calibri"/>
+                <w:b/>
+                <w:bCs/>
+                <w:color w:val="FFFFFF"/>
+                <w:sz w:val="20"/>
+                <w:szCs w:val="20"/>
+              </w:rPr>
+              <w:t xml:space="preserve">Aspecto</w:t>
+            </w:r>
+          </w:p>
+        </w:tc>
+        <w:tc>
+          <w:tcPr>
+            <w:tcW w:w="6800" w:type="dxa"/>
+            <w:shd w:val="clear" w:color="auto" w:fill="24425E"/>
+            <w:tcMar>
+              <w:top w:w="100" w:type="dxa"/>
+              <w:left w:w="120" w:type="dxa"/>
+              <w:bottom w:w="100" w:type="dxa"/>
+              <w:right w:w="120" w:type="dxa"/>
+            </w:tcMar>
+            <w:vAlign w:val="center"/>
+          </w:tcPr>
+          <w:p>
+            <w:r>
+              <w:rPr>
+                <w:rFonts w:ascii="Calibri" w:eastAsia="Calibri" w:hAnsi="Calibri" w:cs="Calibri"/>
+                <w:b/>
+                <w:bCs/>
+                <w:color w:val="FFFFFF"/>
+                <w:sz w:val="20"/>
+                <w:szCs w:val="20"/>
+              </w:rPr>
+              <w:t xml:space="preserve">Descripción</w:t>
+            </w:r>
+          </w:p>
+        </w:tc>
+      </w:tr>
+      <w:tr>
+        <w:trPr>
+          <w:cantSplit/>
+        </w:trPr>
+        <w:tc>
+          <w:tcPr>
+            <w:tcW w:w="2200" w:type="dxa"/>
+            <w:shd w:val="clear" w:color="auto" w:fill="FFFFFF"/>
+            <w:tcMar>
+              <w:top w:w="100" w:type="dxa"/>
+              <w:left w:w="120" w:type="dxa"/>
+              <w:bottom w:w="100" w:type="dxa"/>
+              <w:right w:w="120" w:type="dxa"/>
+            </w:tcMar>
+            <w:vAlign w:val="center"/>
+          </w:tcPr>
+          <w:p>
+            <w:r>
+              <w:rPr>
+                <w:rFonts w:ascii="Calibri" w:eastAsia="Calibri" w:hAnsi="Calibri" w:cs="Calibri"/>
+                <w:b/>
+                <w:bCs/>
+                <w:color w:val="222222"/>
+                <w:sz w:val="20"/>
+                <w:szCs w:val="20"/>
+              </w:rPr>
+              <w:t xml:space="preserve">Datos almacenados</w:t>
+            </w:r>
+          </w:p>
+        </w:tc>
+        <w:tc>
+          <w:tcPr>
+            <w:tcW w:w="6800" w:type="dxa"/>
+            <w:shd w:val="clear" w:color="auto" w:fill="FFFFFF"/>
+            <w:tcMar>
+              <w:top w:w="100" w:type="dxa"/>
+              <w:left w:w="120" w:type="dxa"/>
+              <w:bottom w:w="100" w:type="dxa"/>
+              <w:right w:w="120" w:type="dxa"/>
+            </w:tcMar>
+            <w:vAlign w:val="center"/>
+          </w:tcPr>
+          <w:p>
+            <w:r>
+              <w:rPr>
+                <w:rFonts w:ascii="Calibri" w:eastAsia="Calibri" w:hAnsi="Calibri" w:cs="Calibri"/>
+                <w:color w:val="222222"/>
+                <w:sz w:val="20"/>
+                <w:szCs w:val="20"/>
+              </w:rPr>
+              <w:t xml:space="preserve">Texto de las consultas del estudiante y de las respuestas de Ada, fecha y hora, un título (los primeros 60 caracteres de la primera consulta) y dos identificadores seudónimos (de usuario y de conversación). No se almacenan nombre, correo, documento de identidad, calificaciones ni datos académicos de Moodle.</w:t>
+            </w:r>
+          </w:p>
+        </w:tc>
+      </w:tr>
+      <w:tr>
+        <w:trPr>
+          <w:cantSplit/>
+        </w:trPr>
+        <w:tc>
+          <w:tcPr>
+            <w:tcW w:w="2200" w:type="dxa"/>
+            <w:shd w:val="clear" w:color="auto" w:fill="F2F4F5"/>
+            <w:tcMar>
+              <w:top w:w="100" w:type="dxa"/>
+              <w:left w:w="120" w:type="dxa"/>
+              <w:bottom w:w="100" w:type="dxa"/>
+              <w:right w:w="120" w:type="dxa"/>
+            </w:tcMar>
+            <w:vAlign w:val="center"/>
+          </w:tcPr>
+          <w:p>
+            <w:r>
+              <w:rPr>
+                <w:rFonts w:ascii="Calibri" w:eastAsia="Calibri" w:hAnsi="Calibri" w:cs="Calibri"/>
+                <w:b/>
+                <w:bCs/>
+                <w:color w:val="222222"/>
+                <w:sz w:val="20"/>
+                <w:szCs w:val="20"/>
+              </w:rPr>
+              <w:t xml:space="preserve">Dónde se almacenan</w:t>
+            </w:r>
+          </w:p>
+        </w:tc>
+        <w:tc>
+          <w:tcPr>
+            <w:tcW w:w="6800" w:type="dxa"/>
+            <w:shd w:val="clear" w:color="auto" w:fill="F2F4F5"/>
+            <w:tcMar>
+              <w:top w:w="100" w:type="dxa"/>
+              <w:left w:w="120" w:type="dxa"/>
+              <w:bottom w:w="100" w:type="dxa"/>
+              <w:right w:w="120" w:type="dxa"/>
+            </w:tcMar>
+            <w:vAlign w:val="center"/>
+          </w:tcPr>
+          <w:p>
+            <w:r>
+              <w:rPr>
+                <w:rFonts w:ascii="Calibri" w:eastAsia="Calibri" w:hAnsi="Calibri" w:cs="Calibri"/>
+                <w:color w:val="222222"/>
+                <w:sz w:val="20"/>
+                <w:szCs w:val="20"/>
+              </w:rPr>
+              <w:t xml:space="preserve">En el servidor: volumen persistente de n8n (carpeta historial/&lt;usuario&gt;/&lt;conversación&gt;.json), dentro de la infraestructura del proyecto. En el navegador: copia del chat actual en el almacenamiento local, con clave por cuenta.</w:t>
+            </w:r>
+          </w:p>
+        </w:tc>
+      </w:tr>
+      <w:tr>
+        <w:trPr>
+          <w:cantSplit/>
+        </w:trPr>
+        <w:tc>
+          <w:tcPr>
+            <w:tcW w:w="2200" w:type="dxa"/>
+            <w:shd w:val="clear" w:color="auto" w:fill="FFFFFF"/>
+            <w:tcMar>
+              <w:top w:w="100" w:type="dxa"/>
+              <w:left w:w="120" w:type="dxa"/>
+              <w:bottom w:w="100" w:type="dxa"/>
+              <w:right w:w="120" w:type="dxa"/>
+            </w:tcMar>
+            <w:vAlign w:val="center"/>
+          </w:tcPr>
+          <w:p>
+            <w:r>
+              <w:rPr>
+                <w:rFonts w:ascii="Calibri" w:eastAsia="Calibri" w:hAnsi="Calibri" w:cs="Calibri"/>
+                <w:b/>
+                <w:bCs/>
+                <w:color w:val="222222"/>
+                <w:sz w:val="20"/>
+                <w:szCs w:val="20"/>
+              </w:rPr>
+              <w:t xml:space="preserve">Finalidad</w:t>
+            </w:r>
+          </w:p>
+        </w:tc>
+        <w:tc>
+          <w:tcPr>
+            <w:tcW w:w="6800" w:type="dxa"/>
+            <w:shd w:val="clear" w:color="auto" w:fill="FFFFFF"/>
+            <w:tcMar>
+              <w:top w:w="100" w:type="dxa"/>
+              <w:left w:w="120" w:type="dxa"/>
+              <w:bottom w:w="100" w:type="dxa"/>
+              <w:right w:w="120" w:type="dxa"/>
+            </w:tcMar>
+            <w:vAlign w:val="center"/>
+          </w:tcPr>
+          <w:p>
+            <w:r>
+              <w:rPr>
+                <w:rFonts w:ascii="Calibri" w:eastAsia="Calibri" w:hAnsi="Calibri" w:cs="Calibri"/>
+                <w:color w:val="222222"/>
+                <w:sz w:val="20"/>
+                <w:szCs w:val="20"/>
+              </w:rPr>
+              <w:t xml:space="preserve">Dar continuidad a la conversación en curso (contexto para el modelo) y permitir que el estudiante consulte y retome sus conversaciones anteriores. No se usan con fines estadísticos ni se comparten con terceros.</w:t>
+            </w:r>
+          </w:p>
+        </w:tc>
+      </w:tr>
+      <w:tr>
+        <w:trPr>
+          <w:cantSplit/>
+        </w:trPr>
+        <w:tc>
+          <w:tcPr>
+            <w:tcW w:w="2200" w:type="dxa"/>
+            <w:shd w:val="clear" w:color="auto" w:fill="F2F4F5"/>
+            <w:tcMar>
+              <w:top w:w="100" w:type="dxa"/>
+              <w:left w:w="120" w:type="dxa"/>
+              <w:bottom w:w="100" w:type="dxa"/>
+              <w:right w:w="120" w:type="dxa"/>
+            </w:tcMar>
+            <w:vAlign w:val="center"/>
+          </w:tcPr>
+          <w:p>
+            <w:r>
+              <w:rPr>
+                <w:rFonts w:ascii="Calibri" w:eastAsia="Calibri" w:hAnsi="Calibri" w:cs="Calibri"/>
+                <w:b/>
+                <w:bCs/>
+                <w:color w:val="222222"/>
+                <w:sz w:val="20"/>
+                <w:szCs w:val="20"/>
+              </w:rPr>
+              <w:t xml:space="preserve">Plazo de conservación</w:t>
+            </w:r>
+          </w:p>
+        </w:tc>
+        <w:tc>
+          <w:tcPr>
+            <w:tcW w:w="6800" w:type="dxa"/>
+            <w:shd w:val="clear" w:color="auto" w:fill="F2F4F5"/>
+            <w:tcMar>
+              <w:top w:w="100" w:type="dxa"/>
+              <w:left w:w="120" w:type="dxa"/>
+              <w:bottom w:w="100" w:type="dxa"/>
+              <w:right w:w="120" w:type="dxa"/>
+            </w:tcMar>
+            <w:vAlign w:val="center"/>
+          </w:tcPr>
+          <w:p>
+            <w:r>
+              <w:rPr>
+                <w:rFonts w:ascii="Calibri" w:eastAsia="Calibri" w:hAnsi="Calibri" w:cs="Calibri"/>
+                <w:color w:val="222222"/>
+                <w:sz w:val="20"/>
+                <w:szCs w:val="20"/>
+              </w:rPr>
+              <w:t xml:space="preserve">30 días desde la última actividad de cada conversación; después se eliminan automáticamente (purga programada cada noche a las 03:00). La copia local se elimina al cerrar sesión o al ingresar otra cuenta en el mismo navegador.</w:t>
+            </w:r>
+          </w:p>
+        </w:tc>
+      </w:tr>
+      <w:tr>
+        <w:trPr>
+          <w:cantSplit/>
+        </w:trPr>
+        <w:tc>
+          <w:tcPr>
+            <w:tcW w:w="2200" w:type="dxa"/>
+            <w:shd w:val="clear" w:color="auto" w:fill="FFFFFF"/>
+            <w:tcMar>
+              <w:top w:w="100" w:type="dxa"/>
+              <w:left w:w="120" w:type="dxa"/>
+              <w:bottom w:w="100" w:type="dxa"/>
+              <w:right w:w="120" w:type="dxa"/>
+            </w:tcMar>
+            <w:vAlign w:val="center"/>
+          </w:tcPr>
+          <w:p>
+            <w:r>
+              <w:rPr>
+                <w:rFonts w:ascii="Calibri" w:eastAsia="Calibri" w:hAnsi="Calibri" w:cs="Calibri"/>
+                <w:b/>
+                <w:bCs/>
+                <w:color w:val="222222"/>
+                <w:sz w:val="20"/>
+                <w:szCs w:val="20"/>
+              </w:rPr>
+              <w:t xml:space="preserve">Quién puede acceder</w:t>
+            </w:r>
+          </w:p>
+        </w:tc>
+        <w:tc>
+          <w:tcPr>
+            <w:tcW w:w="6800" w:type="dxa"/>
+            <w:shd w:val="clear" w:color="auto" w:fill="FFFFFF"/>
+            <w:tcMar>
+              <w:top w:w="100" w:type="dxa"/>
+              <w:left w:w="120" w:type="dxa"/>
+              <w:bottom w:w="100" w:type="dxa"/>
+              <w:right w:w="120" w:type="dxa"/>
+            </w:tcMar>
+            <w:vAlign w:val="center"/>
+          </w:tcPr>
+          <w:p>
+            <w:r>
+              <w:rPr>
+                <w:rFonts w:ascii="Calibri" w:eastAsia="Calibri" w:hAnsi="Calibri" w:cs="Calibri"/>
+                <w:color w:val="222222"/>
+                <w:sz w:val="20"/>
+                <w:szCs w:val="20"/>
+              </w:rPr>
+              <w:t xml:space="preserve">El propio estudiante, mediante su panel de historial (el servidor solo entrega la carpeta del identificador que consulta), y el administrador del servidor con acceso al volumen. Otros estudiantes no ven conversaciones ajenas, aunque compartan equipo.</w:t>
+            </w:r>
+          </w:p>
+        </w:tc>
+      </w:tr>
+      <w:tr>
+        <w:trPr>
+          <w:cantSplit/>
+        </w:trPr>
+        <w:tc>
+          <w:tcPr>
+            <w:tcW w:w="2200" w:type="dxa"/>
+            <w:shd w:val="clear" w:color="auto" w:fill="F2F4F5"/>
+            <w:tcMar>
+              <w:top w:w="100" w:type="dxa"/>
+              <w:left w:w="120" w:type="dxa"/>
+              <w:bottom w:w="100" w:type="dxa"/>
+              <w:right w:w="120" w:type="dxa"/>
+            </w:tcMar>
+            <w:vAlign w:val="center"/>
+          </w:tcPr>
+          <w:p>
+            <w:r>
+              <w:rPr>
+                <w:rFonts w:ascii="Calibri" w:eastAsia="Calibri" w:hAnsi="Calibri" w:cs="Calibri"/>
+                <w:b/>
+                <w:bCs/>
+                <w:color w:val="222222"/>
+                <w:sz w:val="20"/>
+                <w:szCs w:val="20"/>
+              </w:rPr>
+              <w:t xml:space="preserve">Cómo se elimina</w:t>
+            </w:r>
+          </w:p>
+        </w:tc>
+        <w:tc>
+          <w:tcPr>
+            <w:tcW w:w="6800" w:type="dxa"/>
+            <w:shd w:val="clear" w:color="auto" w:fill="F2F4F5"/>
+            <w:tcMar>
+              <w:top w:w="100" w:type="dxa"/>
+              <w:left w:w="120" w:type="dxa"/>
+              <w:bottom w:w="100" w:type="dxa"/>
+              <w:right w:w="120" w:type="dxa"/>
+            </w:tcMar>
+            <w:vAlign w:val="center"/>
+          </w:tcPr>
+          <w:p>
+            <w:r>
+              <w:rPr>
+                <w:rFonts w:ascii="Calibri" w:eastAsia="Calibri" w:hAnsi="Calibri" w:cs="Calibri"/>
+                <w:color w:val="222222"/>
+                <w:sz w:val="20"/>
+                <w:szCs w:val="20"/>
+              </w:rPr>
+              <w:t xml:space="preserve">Por el estudiante: botón para borrar una conversación o todo el historial. Automática: purga a los 30 días. Local: al cerrar sesión.</w:t>
+            </w:r>
+          </w:p>
+        </w:tc>
+      </w:tr>
+      <w:tr>
+        <w:trPr>
+          <w:cantSplit/>
+        </w:trPr>
+        <w:tc>
+          <w:tcPr>
+            <w:tcW w:w="2200" w:type="dxa"/>
+            <w:shd w:val="clear" w:color="auto" w:fill="FFFFFF"/>
+            <w:tcMar>
+              <w:top w:w="100" w:type="dxa"/>
+              <w:left w:w="120" w:type="dxa"/>
+              <w:bottom w:w="100" w:type="dxa"/>
+              <w:right w:w="120" w:type="dxa"/>
+            </w:tcMar>
+            <w:vAlign w:val="center"/>
+          </w:tcPr>
+          <w:p>
+            <w:r>
+              <w:rPr>
+                <w:rFonts w:ascii="Calibri" w:eastAsia="Calibri" w:hAnsi="Calibri" w:cs="Calibri"/>
+                <w:b/>
+                <w:bCs/>
+                <w:color w:val="222222"/>
+                <w:sz w:val="20"/>
+                <w:szCs w:val="20"/>
+              </w:rPr>
+              <w:t xml:space="preserve">Medidas de seguridad y protección de datos</w:t>
+            </w:r>
+          </w:p>
+        </w:tc>
+        <w:tc>
+          <w:tcPr>
+            <w:tcW w:w="6800" w:type="dxa"/>
+            <w:shd w:val="clear" w:color="auto" w:fill="FFFFFF"/>
+            <w:tcMar>
+              <w:top w:w="100" w:type="dxa"/>
+              <w:left w:w="120" w:type="dxa"/>
+              <w:bottom w:w="100" w:type="dxa"/>
+              <w:right w:w="120" w:type="dxa"/>
+            </w:tcMar>
+            <w:vAlign w:val="center"/>
+          </w:tcPr>
+          <w:p>
+            <w:r>
+              <w:rPr>
+                <w:rFonts w:ascii="Calibri" w:eastAsia="Calibri" w:hAnsi="Calibri" w:cs="Calibri"/>
+                <w:color w:val="222222"/>
+                <w:sz w:val="20"/>
+                <w:szCs w:val="20"/>
+              </w:rPr>
+              <w:t xml:space="preserve">Identificadores seudónimos no reversibles (HMAC-SHA256 con secreto del servidor); endpoint de identidad restringido a sesiones autenticadas (no invitados); validación estricta de identificadores para impedir el acceso a rutas arbitrarias; procesamiento local, sin envío a servicios de terceros; aislamiento por usuario; límite de 200 mensajes por conversación.</w:t>
+            </w:r>
+          </w:p>
+        </w:tc>
+      </w:tr>
+      <w:tr>
+        <w:trPr>
+          <w:cantSplit/>
+        </w:trPr>
+        <w:tc>
+          <w:tcPr>
+            <w:tcW w:w="2200" w:type="dxa"/>
+            <w:shd w:val="clear" w:color="auto" w:fill="F2F4F5"/>
+            <w:tcMar>
+              <w:top w:w="100" w:type="dxa"/>
+              <w:left w:w="120" w:type="dxa"/>
+              <w:bottom w:w="100" w:type="dxa"/>
+              <w:right w:w="120" w:type="dxa"/>
+            </w:tcMar>
+            <w:vAlign w:val="center"/>
+          </w:tcPr>
+          <w:p>
+            <w:r>
+              <w:rPr>
+                <w:rFonts w:ascii="Calibri" w:eastAsia="Calibri" w:hAnsi="Calibri" w:cs="Calibri"/>
+                <w:b/>
+                <w:bCs/>
+                <w:color w:val="222222"/>
+                <w:sz w:val="20"/>
+                <w:szCs w:val="20"/>
+              </w:rPr>
+              <w:t xml:space="preserve">Limitaciones conocidas</w:t>
+            </w:r>
+          </w:p>
+        </w:tc>
+        <w:tc>
+          <w:tcPr>
+            <w:tcW w:w="6800" w:type="dxa"/>
+            <w:shd w:val="clear" w:color="auto" w:fill="F2F4F5"/>
+            <w:tcMar>
+              <w:top w:w="100" w:type="dxa"/>
+              <w:left w:w="120" w:type="dxa"/>
+              <w:bottom w:w="100" w:type="dxa"/>
+              <w:right w:w="120" w:type="dxa"/>
+            </w:tcMar>
+            <w:vAlign w:val="center"/>
+          </w:tcPr>
+          <w:p>
+            <w:r>
+              <w:rPr>
+                <w:rFonts w:ascii="Calibri" w:eastAsia="Calibri" w:hAnsi="Calibri" w:cs="Calibri"/>
+                <w:color w:val="222222"/>
+                <w:sz w:val="20"/>
+                <w:szCs w:val="20"/>
+              </w:rPr>
+              <w:t xml:space="preserve">Los archivos no están cifrados en reposo; el webhook de n8n no verifica una firma del identificador (se apoya en que es un valor de 128 bits difícil de adivinar); la purga se basa en la fecha de modificación del archivo. Para producción se recomienda cifrar el volumen, autenticar el webhook y publicar una política de tratamiento de datos con aviso al usuario (Ley 1581 de 2012).</w:t>
+            </w:r>
+          </w:p>
+        </w:tc>
+      </w:tr>
+    </w:tbl>
+    <w:p>
+      <w:pPr>
+        <w:pStyle w:val="Ttulo1"/>
+        <w:pBdr>
+          <w:bottom w:val="single" w:sz="6" w:space="4" w:color="D98E3A"/>
+        </w:pBdr>
+        <w:spacing w:before="480" w:after="200"/>
+      </w:pPr>
+      <w:r>
+        <w:rPr>
+          <w:rFonts w:ascii="Calibri" w:eastAsia="Calibri" w:hAnsi="Calibri" w:cs="Calibri"/>
+          <w:b/>
+          <w:bCs/>
+          <w:color w:val="D98E3A"/>
+          <w:sz w:val="30"/>
+          <w:szCs w:val="30"/>
+        </w:rPr>
+        <w:t xml:space="preserve">8.  </w:t>
+      </w:r>
+      <w:r>
+        <w:rPr>
+          <w:rFonts w:ascii="Calibri" w:eastAsia="Calibri" w:hAnsi="Calibri" w:cs="Calibri"/>
+          <w:b/>
+          <w:bCs/>
+          <w:color w:val="24425E"/>
+          <w:sz w:val="30"/>
+          <w:szCs w:val="30"/>
+        </w:rPr>
+        <w:t xml:space="preserve">Límites y consideraciones de escalabilidad</w:t>
       </w:r>
     </w:p>
     <w:p>

</xml_diff>

<commit_message>
Catalogo con busqueda en el servidor, busqueda por tema, enlaces clicables y validacion con 1002 cursos
- bridge/ada_catalogo.php; widget con respuestas rapidas por tema, enlace, listado y detalle
- workflow principal: contexto del modelo solo con cursos relevantes
- catalogo-prueba/: generador y borrado del catalogo sintetico
- anexos actualizados

Co-Authored-By: Claude Sonnet 5.5 <noreply@anthropic.com>
</commit_message>
<xml_diff>
--- a/anexos/1_Manual_Tecnico_Arquitectura_Ada.docx
+++ b/anexos/1_Manual_Tecnico_Arquitectura_Ada.docx
@@ -137,7 +137,7 @@
           <w:sz w:val="22"/>
           <w:szCs w:val="22"/>
         </w:rPr>
-        <w:t xml:space="preserve">Versión 1.1</w:t>
+        <w:t xml:space="preserve">Versión 1.2</w:t>
       </w:r>
     </w:p>
     <w:p>
@@ -1029,6 +1029,80 @@
           </w:p>
         </w:tc>
       </w:tr>
+      <w:tr>
+        <w:tblPrEx>
+          <w:tblCellMar>
+            <w:top w:w="0" w:type="dxa"/>
+            <w:bottom w:w="0" w:type="dxa"/>
+          </w:tblCellMar>
+        </w:tblPrEx>
+        <w:tc>
+          <w:tcPr>
+            <w:tcW w:w="0" w:type="auto"/>
+            <w:shd w:val="clear" w:color="auto" w:fill="F2F4F5"/>
+            <w:tcMar>
+              <w:top w:w="100" w:type="dxa"/>
+              <w:left w:w="120" w:type="dxa"/>
+              <w:bottom w:w="100" w:type="dxa"/>
+              <w:right w:w="120" w:type="dxa"/>
+            </w:tcMar>
+            <w:vAlign w:val="center"/>
+          </w:tcPr>
+          <w:p>
+            <w:r>
+              <w:rPr>
+                <w:rFonts w:ascii="Calibri" w:eastAsia="Calibri" w:hAnsi="Calibri" w:cs="Calibri"/>
+                <w:color w:val="222222"/>
+              </w:rPr>
+              <w:t xml:space="preserve">Endpoint de catálogo</w:t>
+            </w:r>
+          </w:p>
+        </w:tc>
+        <w:tc>
+          <w:tcPr>
+            <w:tcW w:w="0" w:type="auto"/>
+            <w:shd w:val="clear" w:color="auto" w:fill="F2F4F5"/>
+            <w:tcMar>
+              <w:top w:w="100" w:type="dxa"/>
+              <w:left w:w="120" w:type="dxa"/>
+              <w:bottom w:w="100" w:type="dxa"/>
+              <w:right w:w="120" w:type="dxa"/>
+            </w:tcMar>
+            <w:vAlign w:val="center"/>
+          </w:tcPr>
+          <w:p>
+            <w:r>
+              <w:rPr>
+                <w:rFonts w:ascii="Calibri" w:eastAsia="Calibri" w:hAnsi="Calibri" w:cs="Calibri"/>
+                <w:color w:val="222222"/>
+              </w:rPr>
+              <w:t xml:space="preserve">Script PHP (ada_catalogo.php) dentro de Moodle</w:t>
+            </w:r>
+          </w:p>
+        </w:tc>
+        <w:tc>
+          <w:tcPr>
+            <w:tcW w:w="0" w:type="auto"/>
+            <w:shd w:val="clear" w:color="auto" w:fill="F2F4F5"/>
+            <w:tcMar>
+              <w:top w:w="100" w:type="dxa"/>
+              <w:left w:w="120" w:type="dxa"/>
+              <w:bottom w:w="100" w:type="dxa"/>
+              <w:right w:w="120" w:type="dxa"/>
+            </w:tcMar>
+            <w:vAlign w:val="center"/>
+          </w:tcPr>
+          <w:p>
+            <w:r>
+              <w:rPr>
+                <w:rFonts w:ascii="Calibri" w:eastAsia="Calibri" w:hAnsi="Calibri" w:cs="Calibri"/>
+                <w:color w:val="222222"/>
+              </w:rPr>
+              <w:t xml:space="preserve">Consulta directa a la base de datos: resumen, búsqueda por tema, detalle de un curso y contexto para el modelo</w:t>
+            </w:r>
+          </w:p>
+        </w:tc>
+      </w:tr>
     </w:tbl>
     <w:p>
       <w:pPr>
@@ -1220,7 +1294,7 @@
           <w:sz w:val="22"/>
           <w:szCs w:val="22"/>
         </w:rPr>
-        <w:t>Preguntas estructuradas (cuántos cursos hay, cuántas unidades tiene un curso y qué contenidos cubre) se resuelven leyendo directamente la respuesta del Bridge REST y armando el texto de respuesta con datos reales, sin interpretación del modelo de lenguaje.</w:t>
+        <w:t xml:space="preserve">Preguntas estructuradas (listado de cursos, unidades y contenidos de un curso, búsqueda de cursos por tema y solicitud del enlace de un curso) se resuelven consultando el endpoint de catálogo y armando el texto de respuesta con datos reales, sin interpretación del modelo de lenguaje; toda respuesta que menciona cursos incluye su enlace.</w:t>
       </w:r>
     </w:p>
     <w:p>
@@ -1258,7 +1332,7 @@
           <w:sz w:val="22"/>
           <w:szCs w:val="22"/>
         </w:rPr>
-        <w:t xml:space="preserve">Cualquier consulta que no calce con un patrón reconocido se procesa mediante el flujo completo: n8n recupera los últimos mensajes de la conversación actual, consulta el Bridge, construye un prompt estructurado y lo envía a Ollama.</w:t>
+        <w:t xml:space="preserve">Cualquier consulta que no calce con un patrón reconocido se procesa mediante el flujo completo: n8n recupera los últimos mensajes de la conversación actual, consulta el catálogo (solo los cursos relevantes a la consulta), construye un prompt estructurado y lo envía a Ollama.</w:t>
       </w:r>
     </w:p>
     <w:p>
@@ -1894,6 +1968,80 @@
           </w:p>
         </w:tc>
       </w:tr>
+      <w:tr>
+        <w:tblPrEx>
+          <w:tblCellMar>
+            <w:top w:w="0" w:type="dxa"/>
+            <w:bottom w:w="0" w:type="dxa"/>
+          </w:tblCellMar>
+        </w:tblPrEx>
+        <w:tc>
+          <w:tcPr>
+            <w:tcW w:w="0" w:type="auto"/>
+            <w:shd w:val="clear" w:color="auto" w:fill="F2F4F5"/>
+            <w:tcMar>
+              <w:top w:w="100" w:type="dxa"/>
+              <w:left w:w="120" w:type="dxa"/>
+              <w:bottom w:w="100" w:type="dxa"/>
+              <w:right w:w="120" w:type="dxa"/>
+            </w:tcMar>
+            <w:vAlign w:val="center"/>
+          </w:tcPr>
+          <w:p>
+            <w:r>
+              <w:rPr>
+                <w:rFonts w:ascii="Calibri" w:eastAsia="Calibri" w:hAnsi="Calibri" w:cs="Calibri"/>
+                <w:color w:val="222222"/>
+              </w:rPr>
+              <w:t xml:space="preserve">/local/ada_catalogo.php (Moodle)</w:t>
+            </w:r>
+          </w:p>
+        </w:tc>
+        <w:tc>
+          <w:tcPr>
+            <w:tcW w:w="0" w:type="auto"/>
+            <w:shd w:val="clear" w:color="auto" w:fill="F2F4F5"/>
+            <w:tcMar>
+              <w:top w:w="100" w:type="dxa"/>
+              <w:left w:w="120" w:type="dxa"/>
+              <w:bottom w:w="100" w:type="dxa"/>
+              <w:right w:w="120" w:type="dxa"/>
+            </w:tcMar>
+            <w:vAlign w:val="center"/>
+          </w:tcPr>
+          <w:p>
+            <w:r>
+              <w:rPr>
+                <w:rFonts w:ascii="Calibri" w:eastAsia="Calibri" w:hAnsi="Calibri" w:cs="Calibri"/>
+                <w:color w:val="222222"/>
+              </w:rPr>
+              <w:t xml:space="preserve">GET</w:t>
+            </w:r>
+          </w:p>
+        </w:tc>
+        <w:tc>
+          <w:tcPr>
+            <w:tcW w:w="0" w:type="auto"/>
+            <w:shd w:val="clear" w:color="auto" w:fill="F2F4F5"/>
+            <w:tcMar>
+              <w:top w:w="100" w:type="dxa"/>
+              <w:left w:w="120" w:type="dxa"/>
+              <w:bottom w:w="100" w:type="dxa"/>
+              <w:right w:w="120" w:type="dxa"/>
+            </w:tcMar>
+            <w:vAlign w:val="center"/>
+          </w:tcPr>
+          <w:p>
+            <w:r>
+              <w:rPr>
+                <w:rFonts w:ascii="Calibri" w:eastAsia="Calibri" w:hAnsi="Calibri" w:cs="Calibri"/>
+                <w:color w:val="222222"/>
+              </w:rPr>
+              <w:t xml:space="preserve">Catálogo con búsqueda en el servidor (acciones resumen, buscar, curso y contexto; sección 8)</w:t>
+            </w:r>
+          </w:p>
+        </w:tc>
+      </w:tr>
     </w:tbl>
     <w:p>
       <w:pPr>
@@ -3364,7 +3512,7 @@
           <w:sz w:val="30"/>
           <w:szCs w:val="30"/>
         </w:rPr>
-        <w:t xml:space="preserve">Límites y consideraciones de escalabilidad</w:t>
+        <w:t xml:space="preserve">Catálogo, búsqueda por tema y enlaces</w:t>
       </w:r>
     </w:p>
     <w:p>
@@ -3379,7 +3527,1275 @@
           <w:sz w:val="22"/>
           <w:szCs w:val="22"/>
         </w:rPr>
-        <w:t>El diseño actual fue validado con un catálogo reducido de cursos de prueba. Antes de proyectar el sistema al catálogo completo de la empresa, el equipo técnico debe considerar los siguientes puntos:</w:t>
+        <w:t xml:space="preserve">El bridge original (get_courses_full) hacía varias peticiones HTTP por curso y devolvía el catálogo completo en cada consulta: con 1.002 cursos tardó 86 s y devolvió 1,7 MB. El endpoint /local/ada_catalogo.php lo reemplaza: consulta directamente la base de datos de Moodle, filtra en el servidor y devuelve solo lo necesario, por lo que responde en menos de 0,1 s con 1.002 cursos. Expone únicamente metadatos de cursos visibles (nombre, categoría, unidades y enlace); nunca datos personales.</w:t>
+      </w:r>
+    </w:p>
+    <w:p>
+      <w:pPr>
+        <w:pStyle w:val="Ttulo2"/>
+        <w:spacing w:before="320" w:after="140"/>
+      </w:pPr>
+      <w:r>
+        <w:rPr>
+          <w:rFonts w:ascii="Calibri" w:eastAsia="Calibri" w:hAnsi="Calibri" w:cs="Calibri"/>
+          <w:b/>
+          <w:bCs/>
+          <w:color w:val="4E95C2"/>
+          <w:sz w:val="24"/>
+          <w:szCs w:val="24"/>
+        </w:rPr>
+        <w:t xml:space="preserve">Acciones</w:t>
+      </w:r>
+    </w:p>
+    <w:tbl>
+      <w:tblPr>
+        <w:tblW w:w="5000" w:type="pct"/>
+        <w:tblBorders>
+          <w:top w:val="single" w:sz="4" w:space="0" w:color="C9D2D6"/>
+          <w:left w:val="single" w:sz="4" w:space="0" w:color="C9D2D6"/>
+          <w:bottom w:val="single" w:sz="4" w:space="0" w:color="C9D2D6"/>
+          <w:right w:val="single" w:sz="4" w:space="0" w:color="C9D2D6"/>
+          <w:insideH w:val="single" w:sz="2" w:space="0" w:color="C9D2D6"/>
+          <w:insideV w:val="single" w:sz="2" w:space="0" w:color="C9D2D6"/>
+        </w:tblBorders>
+        <w:tblCellMar>
+          <w:left w:w="10" w:type="dxa"/>
+          <w:right w:w="10" w:type="dxa"/>
+        </w:tblCellMar>
+        <w:tblLook w:val="04A0" w:firstRow="1" w:lastRow="0" w:firstColumn="1" w:lastColumn="0" w:noHBand="0" w:noVBand="1"/>
+      </w:tblPr>
+      <w:tblGrid>
+        <w:gridCol w:w="1500"/>
+        <w:gridCol w:w="2200"/>
+        <w:gridCol w:w="5300"/>
+      </w:tblGrid>
+      <w:tr>
+        <w:trPr>
+          <w:tblHeader/>
+        </w:trPr>
+        <w:tc>
+          <w:tcPr>
+            <w:tcW w:w="1500" w:type="dxa"/>
+            <w:shd w:val="clear" w:color="auto" w:fill="24425E"/>
+            <w:tcMar>
+              <w:top w:w="100" w:type="dxa"/>
+              <w:left w:w="120" w:type="dxa"/>
+              <w:bottom w:w="100" w:type="dxa"/>
+              <w:right w:w="120" w:type="dxa"/>
+            </w:tcMar>
+            <w:vAlign w:val="center"/>
+          </w:tcPr>
+          <w:p>
+            <w:r>
+              <w:rPr>
+                <w:rFonts w:ascii="Calibri" w:eastAsia="Calibri" w:hAnsi="Calibri" w:cs="Calibri"/>
+                <w:b/>
+                <w:bCs/>
+                <w:color w:val="FFFFFF"/>
+                <w:sz w:val="20"/>
+                <w:szCs w:val="20"/>
+              </w:rPr>
+              <w:t xml:space="preserve">Acción</w:t>
+            </w:r>
+          </w:p>
+        </w:tc>
+        <w:tc>
+          <w:tcPr>
+            <w:tcW w:w="2200" w:type="dxa"/>
+            <w:shd w:val="clear" w:color="auto" w:fill="24425E"/>
+            <w:tcMar>
+              <w:top w:w="100" w:type="dxa"/>
+              <w:left w:w="120" w:type="dxa"/>
+              <w:bottom w:w="100" w:type="dxa"/>
+              <w:right w:w="120" w:type="dxa"/>
+            </w:tcMar>
+            <w:vAlign w:val="center"/>
+          </w:tcPr>
+          <w:p>
+            <w:r>
+              <w:rPr>
+                <w:rFonts w:ascii="Calibri" w:eastAsia="Calibri" w:hAnsi="Calibri" w:cs="Calibri"/>
+                <w:b/>
+                <w:bCs/>
+                <w:color w:val="FFFFFF"/>
+                <w:sz w:val="20"/>
+                <w:szCs w:val="20"/>
+              </w:rPr>
+              <w:t xml:space="preserve">Parámetros</w:t>
+            </w:r>
+          </w:p>
+        </w:tc>
+        <w:tc>
+          <w:tcPr>
+            <w:tcW w:w="5300" w:type="dxa"/>
+            <w:shd w:val="clear" w:color="auto" w:fill="24425E"/>
+            <w:tcMar>
+              <w:top w:w="100" w:type="dxa"/>
+              <w:left w:w="120" w:type="dxa"/>
+              <w:bottom w:w="100" w:type="dxa"/>
+              <w:right w:w="120" w:type="dxa"/>
+            </w:tcMar>
+            <w:vAlign w:val="center"/>
+          </w:tcPr>
+          <w:p>
+            <w:r>
+              <w:rPr>
+                <w:rFonts w:ascii="Calibri" w:eastAsia="Calibri" w:hAnsi="Calibri" w:cs="Calibri"/>
+                <w:b/>
+                <w:bCs/>
+                <w:color w:val="FFFFFF"/>
+                <w:sz w:val="20"/>
+                <w:szCs w:val="20"/>
+              </w:rPr>
+              <w:t xml:space="preserve">Devuelve</w:t>
+            </w:r>
+          </w:p>
+        </w:tc>
+      </w:tr>
+      <w:tr>
+        <w:trPr>
+          <w:cantSplit/>
+        </w:trPr>
+        <w:tc>
+          <w:tcPr>
+            <w:tcW w:w="1500" w:type="dxa"/>
+            <w:shd w:val="clear" w:color="auto" w:fill="FFFFFF"/>
+            <w:tcMar>
+              <w:top w:w="100" w:type="dxa"/>
+              <w:left w:w="120" w:type="dxa"/>
+              <w:bottom w:w="100" w:type="dxa"/>
+              <w:right w:w="120" w:type="dxa"/>
+            </w:tcMar>
+            <w:vAlign w:val="center"/>
+          </w:tcPr>
+          <w:p>
+            <w:r>
+              <w:rPr>
+                <w:rFonts w:ascii="Calibri" w:eastAsia="Calibri" w:hAnsi="Calibri" w:cs="Calibri"/>
+                <w:b/>
+                <w:bCs/>
+                <w:color w:val="222222"/>
+                <w:sz w:val="20"/>
+                <w:szCs w:val="20"/>
+              </w:rPr>
+              <w:t xml:space="preserve">resumen</w:t>
+            </w:r>
+          </w:p>
+        </w:tc>
+        <w:tc>
+          <w:tcPr>
+            <w:tcW w:w="2200" w:type="dxa"/>
+            <w:shd w:val="clear" w:color="auto" w:fill="FFFFFF"/>
+            <w:tcMar>
+              <w:top w:w="100" w:type="dxa"/>
+              <w:left w:w="120" w:type="dxa"/>
+              <w:bottom w:w="100" w:type="dxa"/>
+              <w:right w:w="120" w:type="dxa"/>
+            </w:tcMar>
+            <w:vAlign w:val="center"/>
+          </w:tcPr>
+          <w:p>
+            <w:r>
+              <w:rPr>
+                <w:rFonts w:ascii="Calibri" w:eastAsia="Calibri" w:hAnsi="Calibri" w:cs="Calibri"/>
+                <w:color w:val="222222"/>
+                <w:sz w:val="20"/>
+                <w:szCs w:val="20"/>
+              </w:rPr>
+              <w:t xml:space="preserve">—</w:t>
+            </w:r>
+          </w:p>
+        </w:tc>
+        <w:tc>
+          <w:tcPr>
+            <w:tcW w:w="5300" w:type="dxa"/>
+            <w:shd w:val="clear" w:color="auto" w:fill="FFFFFF"/>
+            <w:tcMar>
+              <w:top w:w="100" w:type="dxa"/>
+              <w:left w:w="120" w:type="dxa"/>
+              <w:bottom w:w="100" w:type="dxa"/>
+              <w:right w:w="120" w:type="dxa"/>
+            </w:tcMar>
+            <w:vAlign w:val="center"/>
+          </w:tcPr>
+          <w:p>
+            <w:r>
+              <w:rPr>
+                <w:rFonts w:ascii="Calibri" w:eastAsia="Calibri" w:hAnsi="Calibri" w:cs="Calibri"/>
+                <w:color w:val="222222"/>
+                <w:sz w:val="20"/>
+                <w:szCs w:val="20"/>
+              </w:rPr>
+              <w:t xml:space="preserve">Total de cursos visibles y número de cursos por categoría</w:t>
+            </w:r>
+          </w:p>
+        </w:tc>
+      </w:tr>
+      <w:tr>
+        <w:trPr>
+          <w:cantSplit/>
+        </w:trPr>
+        <w:tc>
+          <w:tcPr>
+            <w:tcW w:w="1500" w:type="dxa"/>
+            <w:shd w:val="clear" w:color="auto" w:fill="F2F4F5"/>
+            <w:tcMar>
+              <w:top w:w="100" w:type="dxa"/>
+              <w:left w:w="120" w:type="dxa"/>
+              <w:bottom w:w="100" w:type="dxa"/>
+              <w:right w:w="120" w:type="dxa"/>
+            </w:tcMar>
+            <w:vAlign w:val="center"/>
+          </w:tcPr>
+          <w:p>
+            <w:r>
+              <w:rPr>
+                <w:rFonts w:ascii="Calibri" w:eastAsia="Calibri" w:hAnsi="Calibri" w:cs="Calibri"/>
+                <w:b/>
+                <w:bCs/>
+                <w:color w:val="222222"/>
+                <w:sz w:val="20"/>
+                <w:szCs w:val="20"/>
+              </w:rPr>
+              <w:t xml:space="preserve">buscar</w:t>
+            </w:r>
+          </w:p>
+        </w:tc>
+        <w:tc>
+          <w:tcPr>
+            <w:tcW w:w="2200" w:type="dxa"/>
+            <w:shd w:val="clear" w:color="auto" w:fill="F2F4F5"/>
+            <w:tcMar>
+              <w:top w:w="100" w:type="dxa"/>
+              <w:left w:w="120" w:type="dxa"/>
+              <w:bottom w:w="100" w:type="dxa"/>
+              <w:right w:w="120" w:type="dxa"/>
+            </w:tcMar>
+            <w:vAlign w:val="center"/>
+          </w:tcPr>
+          <w:p>
+            <w:r>
+              <w:rPr>
+                <w:rFonts w:ascii="Calibri" w:eastAsia="Calibri" w:hAnsi="Calibri" w:cs="Calibri"/>
+                <w:color w:val="222222"/>
+                <w:sz w:val="20"/>
+                <w:szCs w:val="20"/>
+              </w:rPr>
+              <w:t xml:space="preserve">q (texto), limite</w:t>
+            </w:r>
+          </w:p>
+        </w:tc>
+        <w:tc>
+          <w:tcPr>
+            <w:tcW w:w="5300" w:type="dxa"/>
+            <w:shd w:val="clear" w:color="auto" w:fill="F2F4F5"/>
+            <w:tcMar>
+              <w:top w:w="100" w:type="dxa"/>
+              <w:left w:w="120" w:type="dxa"/>
+              <w:bottom w:w="100" w:type="dxa"/>
+              <w:right w:w="120" w:type="dxa"/>
+            </w:tcMar>
+            <w:vAlign w:val="center"/>
+          </w:tcPr>
+          <w:p>
+            <w:r>
+              <w:rPr>
+                <w:rFonts w:ascii="Calibri" w:eastAsia="Calibri" w:hAnsi="Calibri" w:cs="Calibri"/>
+                <w:color w:val="222222"/>
+                <w:sz w:val="20"/>
+                <w:szCs w:val="20"/>
+              </w:rPr>
+              <w:t xml:space="preserve">Cursos que tratan el tema, con enlace, unidades coincidentes y total de coincidencias</w:t>
+            </w:r>
+          </w:p>
+        </w:tc>
+      </w:tr>
+      <w:tr>
+        <w:trPr>
+          <w:cantSplit/>
+        </w:trPr>
+        <w:tc>
+          <w:tcPr>
+            <w:tcW w:w="1500" w:type="dxa"/>
+            <w:shd w:val="clear" w:color="auto" w:fill="FFFFFF"/>
+            <w:tcMar>
+              <w:top w:w="100" w:type="dxa"/>
+              <w:left w:w="120" w:type="dxa"/>
+              <w:bottom w:w="100" w:type="dxa"/>
+              <w:right w:w="120" w:type="dxa"/>
+            </w:tcMar>
+            <w:vAlign w:val="center"/>
+          </w:tcPr>
+          <w:p>
+            <w:r>
+              <w:rPr>
+                <w:rFonts w:ascii="Calibri" w:eastAsia="Calibri" w:hAnsi="Calibri" w:cs="Calibri"/>
+                <w:b/>
+                <w:bCs/>
+                <w:color w:val="222222"/>
+                <w:sz w:val="20"/>
+                <w:szCs w:val="20"/>
+              </w:rPr>
+              <w:t xml:space="preserve">curso</w:t>
+            </w:r>
+          </w:p>
+        </w:tc>
+        <w:tc>
+          <w:tcPr>
+            <w:tcW w:w="2200" w:type="dxa"/>
+            <w:shd w:val="clear" w:color="auto" w:fill="FFFFFF"/>
+            <w:tcMar>
+              <w:top w:w="100" w:type="dxa"/>
+              <w:left w:w="120" w:type="dxa"/>
+              <w:bottom w:w="100" w:type="dxa"/>
+              <w:right w:w="120" w:type="dxa"/>
+            </w:tcMar>
+            <w:vAlign w:val="center"/>
+          </w:tcPr>
+          <w:p>
+            <w:r>
+              <w:rPr>
+                <w:rFonts w:ascii="Calibri" w:eastAsia="Calibri" w:hAnsi="Calibri" w:cs="Calibri"/>
+                <w:color w:val="222222"/>
+                <w:sz w:val="20"/>
+                <w:szCs w:val="20"/>
+              </w:rPr>
+              <w:t xml:space="preserve">q (nombre) o id</w:t>
+            </w:r>
+          </w:p>
+        </w:tc>
+        <w:tc>
+          <w:tcPr>
+            <w:tcW w:w="5300" w:type="dxa"/>
+            <w:shd w:val="clear" w:color="auto" w:fill="FFFFFF"/>
+            <w:tcMar>
+              <w:top w:w="100" w:type="dxa"/>
+              <w:left w:w="120" w:type="dxa"/>
+              <w:bottom w:w="100" w:type="dxa"/>
+              <w:right w:w="120" w:type="dxa"/>
+            </w:tcMar>
+            <w:vAlign w:val="center"/>
+          </w:tcPr>
+          <w:p>
+            <w:r>
+              <w:rPr>
+                <w:rFonts w:ascii="Calibri" w:eastAsia="Calibri" w:hAnsi="Calibri" w:cs="Calibri"/>
+                <w:color w:val="222222"/>
+                <w:sz w:val="20"/>
+                <w:szCs w:val="20"/>
+              </w:rPr>
+              <w:t xml:space="preserve">Un curso con todas sus unidades (nombre, descripción, peso, actividades); indica si el nombre es ambiguo</w:t>
+            </w:r>
+          </w:p>
+        </w:tc>
+      </w:tr>
+      <w:tr>
+        <w:trPr>
+          <w:cantSplit/>
+        </w:trPr>
+        <w:tc>
+          <w:tcPr>
+            <w:tcW w:w="1500" w:type="dxa"/>
+            <w:shd w:val="clear" w:color="auto" w:fill="F2F4F5"/>
+            <w:tcMar>
+              <w:top w:w="100" w:type="dxa"/>
+              <w:left w:w="120" w:type="dxa"/>
+              <w:bottom w:w="100" w:type="dxa"/>
+              <w:right w:w="120" w:type="dxa"/>
+            </w:tcMar>
+            <w:vAlign w:val="center"/>
+          </w:tcPr>
+          <w:p>
+            <w:r>
+              <w:rPr>
+                <w:rFonts w:ascii="Calibri" w:eastAsia="Calibri" w:hAnsi="Calibri" w:cs="Calibri"/>
+                <w:b/>
+                <w:bCs/>
+                <w:color w:val="222222"/>
+                <w:sz w:val="20"/>
+                <w:szCs w:val="20"/>
+              </w:rPr>
+              <w:t xml:space="preserve">contexto</w:t>
+            </w:r>
+          </w:p>
+        </w:tc>
+        <w:tc>
+          <w:tcPr>
+            <w:tcW w:w="2200" w:type="dxa"/>
+            <w:shd w:val="clear" w:color="auto" w:fill="F2F4F5"/>
+            <w:tcMar>
+              <w:top w:w="100" w:type="dxa"/>
+              <w:left w:w="120" w:type="dxa"/>
+              <w:bottom w:w="100" w:type="dxa"/>
+              <w:right w:w="120" w:type="dxa"/>
+            </w:tcMar>
+            <w:vAlign w:val="center"/>
+          </w:tcPr>
+          <w:p>
+            <w:r>
+              <w:rPr>
+                <w:rFonts w:ascii="Calibri" w:eastAsia="Calibri" w:hAnsi="Calibri" w:cs="Calibri"/>
+                <w:color w:val="222222"/>
+                <w:sz w:val="20"/>
+                <w:szCs w:val="20"/>
+              </w:rPr>
+              <w:t xml:space="preserve">q (consulta)</w:t>
+            </w:r>
+          </w:p>
+        </w:tc>
+        <w:tc>
+          <w:tcPr>
+            <w:tcW w:w="5300" w:type="dxa"/>
+            <w:shd w:val="clear" w:color="auto" w:fill="F2F4F5"/>
+            <w:tcMar>
+              <w:top w:w="100" w:type="dxa"/>
+              <w:left w:w="120" w:type="dxa"/>
+              <w:bottom w:w="100" w:type="dxa"/>
+              <w:right w:w="120" w:type="dxa"/>
+            </w:tcMar>
+            <w:vAlign w:val="center"/>
+          </w:tcPr>
+          <w:p>
+            <w:r>
+              <w:rPr>
+                <w:rFonts w:ascii="Calibri" w:eastAsia="Calibri" w:hAnsi="Calibri" w:cs="Calibri"/>
+                <w:color w:val="222222"/>
+                <w:sz w:val="20"/>
+                <w:szCs w:val="20"/>
+              </w:rPr>
+              <w:t xml:space="preserve">Formato del bridge para el prompt: con catálogo pequeño todos los cursos; con catálogo grande solo los 3 más relevantes</w:t>
+            </w:r>
+          </w:p>
+        </w:tc>
+      </w:tr>
+    </w:tbl>
+    <w:p>
+      <w:pPr>
+        <w:pStyle w:val="Ttulo2"/>
+        <w:spacing w:before="320" w:after="140"/>
+      </w:pPr>
+      <w:r>
+        <w:rPr>
+          <w:rFonts w:ascii="Calibri" w:eastAsia="Calibri" w:hAnsi="Calibri" w:cs="Calibri"/>
+          <w:b/>
+          <w:bCs/>
+          <w:color w:val="4E95C2"/>
+          <w:sz w:val="24"/>
+          <w:szCs w:val="24"/>
+        </w:rPr>
+        <w:t xml:space="preserve">Búsqueda por tema</w:t>
+      </w:r>
+    </w:p>
+    <w:p>
+      <w:pPr>
+        <w:spacing w:after="160" w:line="288" w:lineRule="auto"/>
+        <w:jc w:val="both"/>
+      </w:pPr>
+      <w:r>
+        <w:rPr>
+          <w:rFonts w:ascii="Calibri" w:eastAsia="Calibri" w:hAnsi="Calibri" w:cs="Calibri"/>
+          <w:color w:val="222222"/>
+          <w:sz w:val="22"/>
+          <w:szCs w:val="22"/>
+        </w:rPr>
+        <w:t xml:space="preserve">El texto se normaliza (minúsculas, sin tildes, singular/plural y sin palabras vacías como «quiero» o «cursos»). Cada palabra se busca en el nombre del curso (peso 5), el nombre de la unidad (4), la descripción de la unidad, incluido el texto de sus etiquetas (3) y la descripción del curso (1). Los cursos se ordenan por número de palabras coincidentes y por puntaje; la respuesta trae hasta 5 cursos con su enlace, las unidades que coinciden y el total de coincidencias.</w:t>
+      </w:r>
+    </w:p>
+    <w:p>
+      <w:pPr>
+        <w:pStyle w:val="Ttulo2"/>
+        <w:spacing w:before="320" w:after="140"/>
+      </w:pPr>
+      <w:r>
+        <w:rPr>
+          <w:rFonts w:ascii="Calibri" w:eastAsia="Calibri" w:hAnsi="Calibri" w:cs="Calibri"/>
+          <w:b/>
+          <w:bCs/>
+          <w:color w:val="4E95C2"/>
+          <w:sz w:val="24"/>
+          <w:szCs w:val="24"/>
+        </w:rPr>
+        <w:t xml:space="preserve">Respuestas rápidas del widget</w:t>
+      </w:r>
+    </w:p>
+    <w:p>
+      <w:pPr>
+        <w:spacing w:after="160" w:line="288" w:lineRule="auto"/>
+        <w:jc w:val="both"/>
+      </w:pPr>
+      <w:r>
+        <w:rPr>
+          <w:rFonts w:ascii="Calibri" w:eastAsia="Calibri" w:hAnsi="Calibri" w:cs="Calibri"/>
+          <w:color w:val="222222"/>
+          <w:sz w:val="22"/>
+          <w:szCs w:val="22"/>
+        </w:rPr>
+        <w:t xml:space="preserve">El widget clasifica cada mensaje por patrones: pedido de enlace, detalle de un curso, búsqueda por tema (explícita, como «qué cursos hay sobre átomos», o implícita, como «te pedí un enfoque en átomos») y listado. Si el catálogo tiene hasta 6 cursos, el listado muestra todos con su enlace; con más, muestra el total y las categorías e invita a indicar un tema. Un pedido como «dame el enlace» usa los cursos de la última respuesta («curso en foco») o, si no los hay, pregunta de qué curso. Los enlaces se muestran clicables solo si apuntan a este Moodle. Un tema sin coincidencias se responde de forma determinística («No encontré cursos…») y no se delega al modelo, para evitar respuestas inventadas.</w:t>
+      </w:r>
+    </w:p>
+    <w:p>
+      <w:pPr>
+        <w:pStyle w:val="Ttulo2"/>
+        <w:spacing w:before="320" w:after="140"/>
+      </w:pPr>
+      <w:r>
+        <w:rPr>
+          <w:rFonts w:ascii="Calibri" w:eastAsia="Calibri" w:hAnsi="Calibri" w:cs="Calibri"/>
+          <w:b/>
+          <w:bCs/>
+          <w:color w:val="4E95C2"/>
+          <w:sz w:val="24"/>
+          <w:szCs w:val="24"/>
+        </w:rPr>
+        <w:t xml:space="preserve">Contexto para el modelo</w:t>
+      </w:r>
+    </w:p>
+    <w:p>
+      <w:pPr>
+        <w:spacing w:after="160" w:line="288" w:lineRule="auto"/>
+        <w:jc w:val="both"/>
+      </w:pPr>
+      <w:r>
+        <w:rPr>
+          <w:rFonts w:ascii="Calibri" w:eastAsia="Calibri" w:hAnsi="Calibri" w:cs="Calibri"/>
+          <w:color w:val="222222"/>
+          <w:sz w:val="22"/>
+          <w:szCs w:val="22"/>
+        </w:rPr>
+        <w:t xml:space="preserve">Las consultas que no calzan con esos patrones siguen al modelo. El workflow de n8n llama a la acción contexto con el texto de la consulta (enviando la cabecera Host de Moodle) y el prompt recibe solo los 3 cursos más relevantes en lugar del catálogo completo; si ninguno coincide, se le indica que no hay cursos sobre el tema y que no invente.</w:t>
+      </w:r>
+    </w:p>
+    <w:p>
+      <w:pPr>
+        <w:pStyle w:val="Ttulo2"/>
+        <w:spacing w:before="320" w:after="140"/>
+      </w:pPr>
+      <w:r>
+        <w:rPr>
+          <w:rFonts w:ascii="Calibri" w:eastAsia="Calibri" w:hAnsi="Calibri" w:cs="Calibri"/>
+          <w:b/>
+          <w:bCs/>
+          <w:color w:val="4E95C2"/>
+          <w:sz w:val="24"/>
+          <w:szCs w:val="24"/>
+        </w:rPr>
+        <w:t xml:space="preserve">Escalabilidad medida</w:t>
+      </w:r>
+    </w:p>
+    <w:tbl>
+      <w:tblPr>
+        <w:tblW w:w="5000" w:type="pct"/>
+        <w:tblBorders>
+          <w:top w:val="single" w:sz="4" w:space="0" w:color="C9D2D6"/>
+          <w:left w:val="single" w:sz="4" w:space="0" w:color="C9D2D6"/>
+          <w:bottom w:val="single" w:sz="4" w:space="0" w:color="C9D2D6"/>
+          <w:right w:val="single" w:sz="4" w:space="0" w:color="C9D2D6"/>
+          <w:insideH w:val="single" w:sz="2" w:space="0" w:color="C9D2D6"/>
+          <w:insideV w:val="single" w:sz="2" w:space="0" w:color="C9D2D6"/>
+        </w:tblBorders>
+        <w:tblCellMar>
+          <w:left w:w="10" w:type="dxa"/>
+          <w:right w:w="10" w:type="dxa"/>
+        </w:tblCellMar>
+        <w:tblLook w:val="04A0" w:firstRow="1" w:lastRow="0" w:firstColumn="1" w:lastColumn="0" w:noHBand="0" w:noVBand="1"/>
+      </w:tblPr>
+      <w:tblGrid>
+        <w:gridCol w:w="3000"/>
+        <w:gridCol w:w="2800"/>
+        <w:gridCol w:w="3200"/>
+      </w:tblGrid>
+      <w:tr>
+        <w:trPr>
+          <w:tblHeader/>
+        </w:trPr>
+        <w:tc>
+          <w:tcPr>
+            <w:tcW w:w="3000" w:type="dxa"/>
+            <w:shd w:val="clear" w:color="auto" w:fill="24425E"/>
+            <w:tcMar>
+              <w:top w:w="100" w:type="dxa"/>
+              <w:left w:w="120" w:type="dxa"/>
+              <w:bottom w:w="100" w:type="dxa"/>
+              <w:right w:w="120" w:type="dxa"/>
+            </w:tcMar>
+            <w:vAlign w:val="center"/>
+          </w:tcPr>
+          <w:p>
+            <w:r>
+              <w:rPr>
+                <w:rFonts w:ascii="Calibri" w:eastAsia="Calibri" w:hAnsi="Calibri" w:cs="Calibri"/>
+                <w:b/>
+                <w:bCs/>
+                <w:color w:val="FFFFFF"/>
+                <w:sz w:val="20"/>
+                <w:szCs w:val="20"/>
+              </w:rPr>
+              <w:t xml:space="preserve">Operación</w:t>
+            </w:r>
+          </w:p>
+        </w:tc>
+        <w:tc>
+          <w:tcPr>
+            <w:tcW w:w="2800" w:type="dxa"/>
+            <w:shd w:val="clear" w:color="auto" w:fill="24425E"/>
+            <w:tcMar>
+              <w:top w:w="100" w:type="dxa"/>
+              <w:left w:w="120" w:type="dxa"/>
+              <w:bottom w:w="100" w:type="dxa"/>
+              <w:right w:w="120" w:type="dxa"/>
+            </w:tcMar>
+            <w:vAlign w:val="center"/>
+          </w:tcPr>
+          <w:p>
+            <w:r>
+              <w:rPr>
+                <w:rFonts w:ascii="Calibri" w:eastAsia="Calibri" w:hAnsi="Calibri" w:cs="Calibri"/>
+                <w:b/>
+                <w:bCs/>
+                <w:color w:val="FFFFFF"/>
+                <w:sz w:val="20"/>
+                <w:szCs w:val="20"/>
+              </w:rPr>
+              <w:t xml:space="preserve">Bridge original (catálogo completo)</w:t>
+            </w:r>
+          </w:p>
+        </w:tc>
+        <w:tc>
+          <w:tcPr>
+            <w:tcW w:w="3200" w:type="dxa"/>
+            <w:shd w:val="clear" w:color="auto" w:fill="24425E"/>
+            <w:tcMar>
+              <w:top w:w="100" w:type="dxa"/>
+              <w:left w:w="120" w:type="dxa"/>
+              <w:bottom w:w="100" w:type="dxa"/>
+              <w:right w:w="120" w:type="dxa"/>
+            </w:tcMar>
+            <w:vAlign w:val="center"/>
+          </w:tcPr>
+          <w:p>
+            <w:r>
+              <w:rPr>
+                <w:rFonts w:ascii="Calibri" w:eastAsia="Calibri" w:hAnsi="Calibri" w:cs="Calibri"/>
+                <w:b/>
+                <w:bCs/>
+                <w:color w:val="FFFFFF"/>
+                <w:sz w:val="20"/>
+                <w:szCs w:val="20"/>
+              </w:rPr>
+              <w:t xml:space="preserve">Endpoint de catálogo</w:t>
+            </w:r>
+          </w:p>
+        </w:tc>
+      </w:tr>
+      <w:tr>
+        <w:trPr>
+          <w:cantSplit/>
+        </w:trPr>
+        <w:tc>
+          <w:tcPr>
+            <w:tcW w:w="3000" w:type="dxa"/>
+            <w:shd w:val="clear" w:color="auto" w:fill="FFFFFF"/>
+            <w:tcMar>
+              <w:top w:w="100" w:type="dxa"/>
+              <w:left w:w="120" w:type="dxa"/>
+              <w:bottom w:w="100" w:type="dxa"/>
+              <w:right w:w="120" w:type="dxa"/>
+            </w:tcMar>
+            <w:vAlign w:val="center"/>
+          </w:tcPr>
+          <w:p>
+            <w:r>
+              <w:rPr>
+                <w:rFonts w:ascii="Calibri" w:eastAsia="Calibri" w:hAnsi="Calibri" w:cs="Calibri"/>
+                <w:color w:val="222222"/>
+                <w:sz w:val="20"/>
+                <w:szCs w:val="20"/>
+              </w:rPr>
+              <w:t xml:space="preserve">Datos para responder una consulta con 1.002 cursos</w:t>
+            </w:r>
+          </w:p>
+        </w:tc>
+        <w:tc>
+          <w:tcPr>
+            <w:tcW w:w="2800" w:type="dxa"/>
+            <w:shd w:val="clear" w:color="auto" w:fill="FFFFFF"/>
+            <w:tcMar>
+              <w:top w:w="100" w:type="dxa"/>
+              <w:left w:w="120" w:type="dxa"/>
+              <w:bottom w:w="100" w:type="dxa"/>
+              <w:right w:w="120" w:type="dxa"/>
+            </w:tcMar>
+            <w:vAlign w:val="center"/>
+          </w:tcPr>
+          <w:p>
+            <w:r>
+              <w:rPr>
+                <w:rFonts w:ascii="Calibri" w:eastAsia="Calibri" w:hAnsi="Calibri" w:cs="Calibri"/>
+                <w:color w:val="222222"/>
+                <w:sz w:val="20"/>
+                <w:szCs w:val="20"/>
+              </w:rPr>
+              <w:t xml:space="preserve">86,2 s · 1,7 MB (1 medición)</w:t>
+            </w:r>
+          </w:p>
+        </w:tc>
+        <w:tc>
+          <w:tcPr>
+            <w:tcW w:w="3200" w:type="dxa"/>
+            <w:shd w:val="clear" w:color="auto" w:fill="FFFFFF"/>
+            <w:tcMar>
+              <w:top w:w="100" w:type="dxa"/>
+              <w:left w:w="120" w:type="dxa"/>
+              <w:bottom w:w="100" w:type="dxa"/>
+              <w:right w:w="120" w:type="dxa"/>
+            </w:tcMar>
+            <w:vAlign w:val="center"/>
+          </w:tcPr>
+          <w:p>
+            <w:r>
+              <w:rPr>
+                <w:rFonts w:ascii="Calibri" w:eastAsia="Calibri" w:hAnsi="Calibri" w:cs="Calibri"/>
+                <w:color w:val="222222"/>
+                <w:sz w:val="20"/>
+                <w:szCs w:val="20"/>
+              </w:rPr>
+              <w:t xml:space="preserve">—</w:t>
+            </w:r>
+          </w:p>
+        </w:tc>
+      </w:tr>
+      <w:tr>
+        <w:trPr>
+          <w:cantSplit/>
+        </w:trPr>
+        <w:tc>
+          <w:tcPr>
+            <w:tcW w:w="3000" w:type="dxa"/>
+            <w:shd w:val="clear" w:color="auto" w:fill="F2F4F5"/>
+            <w:tcMar>
+              <w:top w:w="100" w:type="dxa"/>
+              <w:left w:w="120" w:type="dxa"/>
+              <w:bottom w:w="100" w:type="dxa"/>
+              <w:right w:w="120" w:type="dxa"/>
+            </w:tcMar>
+            <w:vAlign w:val="center"/>
+          </w:tcPr>
+          <w:p>
+            <w:r>
+              <w:rPr>
+                <w:rFonts w:ascii="Calibri" w:eastAsia="Calibri" w:hAnsi="Calibri" w:cs="Calibri"/>
+                <w:color w:val="222222"/>
+                <w:sz w:val="20"/>
+                <w:szCs w:val="20"/>
+              </w:rPr>
+              <w:t xml:space="preserve">Resumen del catálogo (total y categorías)</w:t>
+            </w:r>
+          </w:p>
+        </w:tc>
+        <w:tc>
+          <w:tcPr>
+            <w:tcW w:w="2800" w:type="dxa"/>
+            <w:shd w:val="clear" w:color="auto" w:fill="F2F4F5"/>
+            <w:tcMar>
+              <w:top w:w="100" w:type="dxa"/>
+              <w:left w:w="120" w:type="dxa"/>
+              <w:bottom w:w="100" w:type="dxa"/>
+              <w:right w:w="120" w:type="dxa"/>
+            </w:tcMar>
+            <w:vAlign w:val="center"/>
+          </w:tcPr>
+          <w:p>
+            <w:r>
+              <w:rPr>
+                <w:rFonts w:ascii="Calibri" w:eastAsia="Calibri" w:hAnsi="Calibri" w:cs="Calibri"/>
+                <w:color w:val="222222"/>
+                <w:sz w:val="20"/>
+                <w:szCs w:val="20"/>
+              </w:rPr>
+              <w:t xml:space="preserve">—</w:t>
+            </w:r>
+          </w:p>
+        </w:tc>
+        <w:tc>
+          <w:tcPr>
+            <w:tcW w:w="3200" w:type="dxa"/>
+            <w:shd w:val="clear" w:color="auto" w:fill="F2F4F5"/>
+            <w:tcMar>
+              <w:top w:w="100" w:type="dxa"/>
+              <w:left w:w="120" w:type="dxa"/>
+              <w:bottom w:w="100" w:type="dxa"/>
+              <w:right w:w="120" w:type="dxa"/>
+            </w:tcMar>
+            <w:vAlign w:val="center"/>
+          </w:tcPr>
+          <w:p>
+            <w:r>
+              <w:rPr>
+                <w:rFonts w:ascii="Calibri" w:eastAsia="Calibri" w:hAnsi="Calibri" w:cs="Calibri"/>
+                <w:color w:val="222222"/>
+                <w:sz w:val="20"/>
+                <w:szCs w:val="20"/>
+              </w:rPr>
+              <w:t xml:space="preserve">34–43 ms</w:t>
+            </w:r>
+          </w:p>
+        </w:tc>
+      </w:tr>
+      <w:tr>
+        <w:trPr>
+          <w:cantSplit/>
+        </w:trPr>
+        <w:tc>
+          <w:tcPr>
+            <w:tcW w:w="3000" w:type="dxa"/>
+            <w:shd w:val="clear" w:color="auto" w:fill="FFFFFF"/>
+            <w:tcMar>
+              <w:top w:w="100" w:type="dxa"/>
+              <w:left w:w="120" w:type="dxa"/>
+              <w:bottom w:w="100" w:type="dxa"/>
+              <w:right w:w="120" w:type="dxa"/>
+            </w:tcMar>
+            <w:vAlign w:val="center"/>
+          </w:tcPr>
+          <w:p>
+            <w:r>
+              <w:rPr>
+                <w:rFonts w:ascii="Calibri" w:eastAsia="Calibri" w:hAnsi="Calibri" w:cs="Calibri"/>
+                <w:color w:val="222222"/>
+                <w:sz w:val="20"/>
+                <w:szCs w:val="20"/>
+              </w:rPr>
+              <w:t xml:space="preserve">Búsqueda por tema</w:t>
+            </w:r>
+          </w:p>
+        </w:tc>
+        <w:tc>
+          <w:tcPr>
+            <w:tcW w:w="2800" w:type="dxa"/>
+            <w:shd w:val="clear" w:color="auto" w:fill="FFFFFF"/>
+            <w:tcMar>
+              <w:top w:w="100" w:type="dxa"/>
+              <w:left w:w="120" w:type="dxa"/>
+              <w:bottom w:w="100" w:type="dxa"/>
+              <w:right w:w="120" w:type="dxa"/>
+            </w:tcMar>
+            <w:vAlign w:val="center"/>
+          </w:tcPr>
+          <w:p>
+            <w:r>
+              <w:rPr>
+                <w:rFonts w:ascii="Calibri" w:eastAsia="Calibri" w:hAnsi="Calibri" w:cs="Calibri"/>
+                <w:color w:val="222222"/>
+                <w:sz w:val="20"/>
+                <w:szCs w:val="20"/>
+              </w:rPr>
+              <w:t xml:space="preserve">—</w:t>
+            </w:r>
+          </w:p>
+        </w:tc>
+        <w:tc>
+          <w:tcPr>
+            <w:tcW w:w="3200" w:type="dxa"/>
+            <w:shd w:val="clear" w:color="auto" w:fill="FFFFFF"/>
+            <w:tcMar>
+              <w:top w:w="100" w:type="dxa"/>
+              <w:left w:w="120" w:type="dxa"/>
+              <w:bottom w:w="100" w:type="dxa"/>
+              <w:right w:w="120" w:type="dxa"/>
+            </w:tcMar>
+            <w:vAlign w:val="center"/>
+          </w:tcPr>
+          <w:p>
+            <w:r>
+              <w:rPr>
+                <w:rFonts w:ascii="Calibri" w:eastAsia="Calibri" w:hAnsi="Calibri" w:cs="Calibri"/>
+                <w:color w:val="222222"/>
+                <w:sz w:val="20"/>
+                <w:szCs w:val="20"/>
+              </w:rPr>
+              <w:t xml:space="preserve">68–88 ms</w:t>
+            </w:r>
+          </w:p>
+        </w:tc>
+      </w:tr>
+      <w:tr>
+        <w:trPr>
+          <w:cantSplit/>
+        </w:trPr>
+        <w:tc>
+          <w:tcPr>
+            <w:tcW w:w="3000" w:type="dxa"/>
+            <w:shd w:val="clear" w:color="auto" w:fill="F2F4F5"/>
+            <w:tcMar>
+              <w:top w:w="100" w:type="dxa"/>
+              <w:left w:w="120" w:type="dxa"/>
+              <w:bottom w:w="100" w:type="dxa"/>
+              <w:right w:w="120" w:type="dxa"/>
+            </w:tcMar>
+            <w:vAlign w:val="center"/>
+          </w:tcPr>
+          <w:p>
+            <w:r>
+              <w:rPr>
+                <w:rFonts w:ascii="Calibri" w:eastAsia="Calibri" w:hAnsi="Calibri" w:cs="Calibri"/>
+                <w:color w:val="222222"/>
+                <w:sz w:val="20"/>
+                <w:szCs w:val="20"/>
+              </w:rPr>
+              <w:t xml:space="preserve">Detalle de un curso</w:t>
+            </w:r>
+          </w:p>
+        </w:tc>
+        <w:tc>
+          <w:tcPr>
+            <w:tcW w:w="2800" w:type="dxa"/>
+            <w:shd w:val="clear" w:color="auto" w:fill="F2F4F5"/>
+            <w:tcMar>
+              <w:top w:w="100" w:type="dxa"/>
+              <w:left w:w="120" w:type="dxa"/>
+              <w:bottom w:w="100" w:type="dxa"/>
+              <w:right w:w="120" w:type="dxa"/>
+            </w:tcMar>
+            <w:vAlign w:val="center"/>
+          </w:tcPr>
+          <w:p>
+            <w:r>
+              <w:rPr>
+                <w:rFonts w:ascii="Calibri" w:eastAsia="Calibri" w:hAnsi="Calibri" w:cs="Calibri"/>
+                <w:color w:val="222222"/>
+                <w:sz w:val="20"/>
+                <w:szCs w:val="20"/>
+              </w:rPr>
+              <w:t xml:space="preserve">—</w:t>
+            </w:r>
+          </w:p>
+        </w:tc>
+        <w:tc>
+          <w:tcPr>
+            <w:tcW w:w="3200" w:type="dxa"/>
+            <w:shd w:val="clear" w:color="auto" w:fill="F2F4F5"/>
+            <w:tcMar>
+              <w:top w:w="100" w:type="dxa"/>
+              <w:left w:w="120" w:type="dxa"/>
+              <w:bottom w:w="100" w:type="dxa"/>
+              <w:right w:w="120" w:type="dxa"/>
+            </w:tcMar>
+            <w:vAlign w:val="center"/>
+          </w:tcPr>
+          <w:p>
+            <w:r>
+              <w:rPr>
+                <w:rFonts w:ascii="Calibri" w:eastAsia="Calibri" w:hAnsi="Calibri" w:cs="Calibri"/>
+                <w:color w:val="222222"/>
+                <w:sz w:val="20"/>
+                <w:szCs w:val="20"/>
+              </w:rPr>
+              <w:t xml:space="preserve">35–49 ms</w:t>
+            </w:r>
+          </w:p>
+        </w:tc>
+      </w:tr>
+      <w:tr>
+        <w:trPr>
+          <w:cantSplit/>
+        </w:trPr>
+        <w:tc>
+          <w:tcPr>
+            <w:tcW w:w="3000" w:type="dxa"/>
+            <w:shd w:val="clear" w:color="auto" w:fill="FFFFFF"/>
+            <w:tcMar>
+              <w:top w:w="100" w:type="dxa"/>
+              <w:left w:w="120" w:type="dxa"/>
+              <w:bottom w:w="100" w:type="dxa"/>
+              <w:right w:w="120" w:type="dxa"/>
+            </w:tcMar>
+            <w:vAlign w:val="center"/>
+          </w:tcPr>
+          <w:p>
+            <w:r>
+              <w:rPr>
+                <w:rFonts w:ascii="Calibri" w:eastAsia="Calibri" w:hAnsi="Calibri" w:cs="Calibri"/>
+                <w:color w:val="222222"/>
+                <w:sz w:val="20"/>
+                <w:szCs w:val="20"/>
+              </w:rPr>
+              <w:t xml:space="preserve">Contexto para el modelo (cursos relevantes)</w:t>
+            </w:r>
+          </w:p>
+        </w:tc>
+        <w:tc>
+          <w:tcPr>
+            <w:tcW w:w="2800" w:type="dxa"/>
+            <w:shd w:val="clear" w:color="auto" w:fill="FFFFFF"/>
+            <w:tcMar>
+              <w:top w:w="100" w:type="dxa"/>
+              <w:left w:w="120" w:type="dxa"/>
+              <w:bottom w:w="100" w:type="dxa"/>
+              <w:right w:w="120" w:type="dxa"/>
+            </w:tcMar>
+            <w:vAlign w:val="center"/>
+          </w:tcPr>
+          <w:p>
+            <w:r>
+              <w:rPr>
+                <w:rFonts w:ascii="Calibri" w:eastAsia="Calibri" w:hAnsi="Calibri" w:cs="Calibri"/>
+                <w:color w:val="222222"/>
+                <w:sz w:val="20"/>
+                <w:szCs w:val="20"/>
+              </w:rPr>
+              <w:t xml:space="preserve">86,2 s (se enviaba el catálogo completo)</w:t>
+            </w:r>
+          </w:p>
+        </w:tc>
+        <w:tc>
+          <w:tcPr>
+            <w:tcW w:w="3200" w:type="dxa"/>
+            <w:shd w:val="clear" w:color="auto" w:fill="FFFFFF"/>
+            <w:tcMar>
+              <w:top w:w="100" w:type="dxa"/>
+              <w:left w:w="120" w:type="dxa"/>
+              <w:bottom w:w="100" w:type="dxa"/>
+              <w:right w:w="120" w:type="dxa"/>
+            </w:tcMar>
+            <w:vAlign w:val="center"/>
+          </w:tcPr>
+          <w:p>
+            <w:r>
+              <w:rPr>
+                <w:rFonts w:ascii="Calibri" w:eastAsia="Calibri" w:hAnsi="Calibri" w:cs="Calibri"/>
+                <w:color w:val="222222"/>
+                <w:sz w:val="20"/>
+                <w:szCs w:val="20"/>
+              </w:rPr>
+              <w:t xml:space="preserve">86–99 ms</w:t>
+            </w:r>
+          </w:p>
+        </w:tc>
+      </w:tr>
+      <w:tr>
+        <w:trPr>
+          <w:cantSplit/>
+        </w:trPr>
+        <w:tc>
+          <w:tcPr>
+            <w:tcW w:w="3000" w:type="dxa"/>
+            <w:shd w:val="clear" w:color="auto" w:fill="F2F4F5"/>
+            <w:tcMar>
+              <w:top w:w="100" w:type="dxa"/>
+              <w:left w:w="120" w:type="dxa"/>
+              <w:bottom w:w="100" w:type="dxa"/>
+              <w:right w:w="120" w:type="dxa"/>
+            </w:tcMar>
+            <w:vAlign w:val="center"/>
+          </w:tcPr>
+          <w:p>
+            <w:r>
+              <w:rPr>
+                <w:rFonts w:ascii="Calibri" w:eastAsia="Calibri" w:hAnsi="Calibri" w:cs="Calibri"/>
+                <w:color w:val="222222"/>
+                <w:sz w:val="20"/>
+                <w:szCs w:val="20"/>
+              </w:rPr>
+              <w:t xml:space="preserve">Tiempo percibido en el widget (media ± desviación, 5 mediciones por consulta)</w:t>
+            </w:r>
+          </w:p>
+        </w:tc>
+        <w:tc>
+          <w:tcPr>
+            <w:tcW w:w="2800" w:type="dxa"/>
+            <w:shd w:val="clear" w:color="auto" w:fill="F2F4F5"/>
+            <w:tcMar>
+              <w:top w:w="100" w:type="dxa"/>
+              <w:left w:w="120" w:type="dxa"/>
+              <w:bottom w:w="100" w:type="dxa"/>
+              <w:right w:w="120" w:type="dxa"/>
+            </w:tcMar>
+            <w:vAlign w:val="center"/>
+          </w:tcPr>
+          <w:p>
+            <w:r>
+              <w:rPr>
+                <w:rFonts w:ascii="Calibri" w:eastAsia="Calibri" w:hAnsi="Calibri" w:cs="Calibri"/>
+                <w:color w:val="222222"/>
+                <w:sz w:val="20"/>
+                <w:szCs w:val="20"/>
+              </w:rPr>
+              <w:t xml:space="preserve">—</w:t>
+            </w:r>
+          </w:p>
+        </w:tc>
+        <w:tc>
+          <w:tcPr>
+            <w:tcW w:w="3200" w:type="dxa"/>
+            <w:shd w:val="clear" w:color="auto" w:fill="F2F4F5"/>
+            <w:tcMar>
+              <w:top w:w="100" w:type="dxa"/>
+              <w:left w:w="120" w:type="dxa"/>
+              <w:bottom w:w="100" w:type="dxa"/>
+              <w:right w:w="120" w:type="dxa"/>
+            </w:tcMar>
+            <w:vAlign w:val="center"/>
+          </w:tcPr>
+          <w:p>
+            <w:r>
+              <w:rPr>
+                <w:rFonts w:ascii="Calibri" w:eastAsia="Calibri" w:hAnsi="Calibri" w:cs="Calibri"/>
+                <w:color w:val="222222"/>
+                <w:sz w:val="20"/>
+                <w:szCs w:val="20"/>
+              </w:rPr>
+              <w:t xml:space="preserve">Tema: 98 ± 18 ms · Enlace por nombre: 61 ± 12 ms · Detalle de unidades: 87 ± 11 ms · Panorama del catálogo: 25 ± 2 ms</w:t>
+            </w:r>
+          </w:p>
+        </w:tc>
+      </w:tr>
+    </w:tbl>
+    <w:tbl>
+      <w:tblPr>
+        <w:tblW w:w="5000" w:type="pct"/>
+        <w:tblBorders>
+          <w:top w:val="single" w:sz="4" w:space="0" w:color="4E95C2"/>
+          <w:left w:val="single" w:sz="24" w:space="0" w:color="4E95C2"/>
+          <w:bottom w:val="single" w:sz="4" w:space="0" w:color="4E95C2"/>
+          <w:right w:val="single" w:sz="4" w:space="0" w:color="4E95C2"/>
+          <w:insideH w:val="single" w:sz="4" w:space="0" w:color="auto"/>
+          <w:insideV w:val="single" w:sz="4" w:space="0" w:color="auto"/>
+        </w:tblBorders>
+        <w:tblCellMar>
+          <w:left w:w="10" w:type="dxa"/>
+          <w:right w:w="10" w:type="dxa"/>
+        </w:tblCellMar>
+        <w:tblLook w:val="04A0" w:firstRow="1" w:lastRow="0" w:firstColumn="1" w:lastColumn="0" w:noHBand="0" w:noVBand="1"/>
+      </w:tblPr>
+      <w:tblGrid>
+        <w:gridCol w:w="8991"/>
+      </w:tblGrid>
+      <w:tr>
+        <w:tblPrEx>
+          <w:tblCellMar>
+            <w:top w:w="0" w:type="dxa"/>
+            <w:bottom w:w="0" w:type="dxa"/>
+          </w:tblCellMar>
+        </w:tblPrEx>
+        <w:tc>
+          <w:tcPr>
+            <w:tcW w:w="0" w:type="auto"/>
+            <w:shd w:val="clear" w:color="auto" w:fill="EAF2F8"/>
+            <w:tcMar>
+              <w:top w:w="160" w:type="dxa"/>
+              <w:left w:w="200" w:type="dxa"/>
+              <w:bottom w:w="160" w:type="dxa"/>
+              <w:right w:w="200" w:type="dxa"/>
+            </w:tcMar>
+          </w:tcPr>
+          <w:p>
+            <w:pPr>
+              <w:spacing w:after="80"/>
+            </w:pPr>
+            <w:r>
+              <w:rPr>
+                <w:rFonts w:ascii="Calibri" w:eastAsia="Calibri" w:hAnsi="Calibri" w:cs="Calibri"/>
+                <w:b/>
+                <w:bCs/>
+                <w:color w:val="24425E"/>
+                <w:sz w:val="22"/>
+                <w:szCs w:val="22"/>
+              </w:rPr>
+              <w:t xml:space="preserve">Limitaciones conocidas</w:t>
+            </w:r>
+          </w:p>
+          <w:p>
+            <w:pPr>
+              <w:spacing w:after="40" w:line="264" w:lineRule="auto"/>
+              <w:jc w:val="both"/>
+            </w:pPr>
+            <w:r>
+              <w:rPr>
+                <w:rFonts w:ascii="Calibri" w:eastAsia="Calibri" w:hAnsi="Calibri" w:cs="Calibri"/>
+                <w:color w:val="333333"/>
+                <w:sz w:val="21"/>
+                <w:szCs w:val="21"/>
+              </w:rPr>
+              <w:t xml:space="preserve">•  La relevancia es por coincidencia de palabras clave; para un catálogo productivo conviene un índice de texto completo.</w:t>
+            </w:r>
+          </w:p>
+          <w:p>
+            <w:pPr>
+              <w:spacing w:after="40" w:line="264" w:lineRule="auto"/>
+              <w:jc w:val="both"/>
+            </w:pPr>
+            <w:r>
+              <w:rPr>
+                <w:rFonts w:ascii="Calibri" w:eastAsia="Calibri" w:hAnsi="Calibri" w:cs="Calibri"/>
+                <w:color w:val="333333"/>
+                <w:sz w:val="21"/>
+                <w:szCs w:val="21"/>
+              </w:rPr>
+              <w:t xml:space="preserve">•  Las mediciones se hicieron con un catálogo sintético de 1.002 cursos; deben confirmarse con el catálogo real de la empresa.</w:t>
+            </w:r>
+          </w:p>
+          <w:p>
+            <w:pPr>
+              <w:spacing w:after="40" w:line="264" w:lineRule="auto"/>
+              <w:jc w:val="both"/>
+            </w:pPr>
+            <w:r>
+              <w:rPr>
+                <w:rFonts w:ascii="Calibri" w:eastAsia="Calibri" w:hAnsi="Calibri" w:cs="Calibri"/>
+                <w:color w:val="333333"/>
+                <w:sz w:val="21"/>
+                <w:szCs w:val="21"/>
+              </w:rPr>
+              <w:t xml:space="preserve">•  El endpoint respeta solo la visibilidad del curso y de la categoría; si la empresa restringe cursos por matrícula, habría que filtrar por usuario.</w:t>
+            </w:r>
+          </w:p>
+        </w:tc>
+      </w:tr>
+    </w:tbl>
+    <w:p>
+      <w:pPr>
+        <w:pStyle w:val="Ttulo1"/>
+        <w:pBdr>
+          <w:bottom w:val="single" w:sz="6" w:space="4" w:color="D98E3A"/>
+        </w:pBdr>
+        <w:spacing w:before="480" w:after="200"/>
+      </w:pPr>
+      <w:r>
+        <w:rPr>
+          <w:rFonts w:ascii="Calibri" w:eastAsia="Calibri" w:hAnsi="Calibri" w:cs="Calibri"/>
+          <w:b/>
+          <w:bCs/>
+          <w:color w:val="D98E3A"/>
+          <w:sz w:val="30"/>
+          <w:szCs w:val="30"/>
+        </w:rPr>
+        <w:t xml:space="preserve">9.  </w:t>
+      </w:r>
+      <w:r>
+        <w:rPr>
+          <w:rFonts w:ascii="Calibri" w:eastAsia="Calibri" w:hAnsi="Calibri" w:cs="Calibri"/>
+          <w:b/>
+          <w:bCs/>
+          <w:color w:val="24425E"/>
+          <w:sz w:val="30"/>
+          <w:szCs w:val="30"/>
+        </w:rPr>
+        <w:t xml:space="preserve">Límites y consideraciones de escalabilidad</w:t>
+      </w:r>
+    </w:p>
+    <w:p>
+      <w:pPr>
+        <w:spacing w:after="160" w:line="288" w:lineRule="auto"/>
+        <w:jc w:val="both"/>
+      </w:pPr>
+      <w:r>
+        <w:rPr>
+          <w:rFonts w:ascii="Calibri" w:eastAsia="Calibri" w:hAnsi="Calibri" w:cs="Calibri"/>
+          <w:color w:val="222222"/>
+          <w:sz w:val="22"/>
+          <w:szCs w:val="22"/>
+        </w:rPr>
+        <w:t xml:space="preserve">El diseño actual fue validado con un catálogo reducido de cursos de prueba. Antes de proyectar el sistema al catálogo completo de la empresa, el equipo técnico debe considerar los siguientes puntos: Posteriormente se validó con un catálogo sintético de 1.002 cursos (sección 8): el bridge original tardó 86 s por consulta y fue reemplazado por el endpoint de catálogo.</w:t>
       </w:r>
     </w:p>
     <w:tbl>

</xml_diff>